<commit_message>
docs: fix encoding corruption, add flowcharts/UI screenshots, regenerate docx
- docs/详细设计/详细设计说明书.md: restore from git history (encoding was corrupted in 5430f61), add 9 flowchart references and 2 UI screenshots, fix M2 section numbering (3.4.5→3.2.5)
- docs/需求分析/需求规格说明书.md: unify Spring Boot version (3.2→3.4.5)
- docs/测试/测试报告.md: unify date (2025→2026)
- scripts/md_to_docx.py: add md-to-docx converter with SVG→PNG support
- Regenerate all 4 .docx files from updated .md sources
</commit_message>
<xml_diff>
--- a/docs/详细设计/详细设计说明书.docx
+++ b/docs/详细设计/详细设计说明书.docx
@@ -42,39 +42,45 @@
     <w:p>
       <w:pPr>
         <w:pStyle w:val="ListBullet"/>
-        <w:spacing w:after="40" w:before="20"/>
-        <w:ind w:left="360"/>
-      </w:pPr>
+      </w:pPr>
+      <w:r/>
       <w:r>
         <w:rPr>
           <w:b/>
         </w:rPr>
+        <w:t>项目名称：</w:t>
+      </w:r>
+      <w:r>
         <w:t xml:space="preserve"> 南信猫友记（NanXin CatBook）</w:t>
       </w:r>
     </w:p>
     <w:p>
       <w:pPr>
         <w:pStyle w:val="ListBullet"/>
-        <w:spacing w:after="40" w:before="20"/>
-        <w:ind w:left="360"/>
-      </w:pPr>
+      </w:pPr>
+      <w:r/>
       <w:r>
         <w:rPr>
           <w:b/>
         </w:rPr>
+        <w:t>系统定位：</w:t>
+      </w:r>
+      <w:r>
         <w:t xml:space="preserve"> 基于已有微信小程序端校园猫平台，在 Web 端实现功能增强与算法扩展</w:t>
       </w:r>
     </w:p>
     <w:p>
       <w:pPr>
         <w:pStyle w:val="ListBullet"/>
-        <w:spacing w:after="40" w:before="20"/>
-        <w:ind w:left="360"/>
-      </w:pPr>
+      </w:pPr>
+      <w:r/>
       <w:r>
         <w:rPr>
           <w:b/>
         </w:rPr>
+        <w:t>实现规模：</w:t>
+      </w:r>
+      <w:r>
         <w:t xml:space="preserve"> 后端约 3000 行 Java 代码（Spring Boot 3.4.5），采用 Controller-Service-Repository 三层架构；核心算法涉及 4 张热度数据表（点赞、关注、评分、行为日志）的融合计算；前端 Vue 3 + Vite 采用 Composition API + Bento Grid 布局，共 9 个页面组件</w:t>
       </w:r>
     </w:p>
@@ -88,17 +94,10 @@
     </w:p>
     <w:tbl>
       <w:tblPr>
+        <w:tblStyle w:val="TableGrid"/>
         <w:tblW w:type="auto" w:w="0"/>
         <w:jc w:val="center"/>
         <w:tblLook w:firstColumn="1" w:firstRow="1" w:lastColumn="0" w:lastRow="0" w:noHBand="0" w:noVBand="1" w:val="04A0"/>
-        <w:tblBorders>
-          <w:top w:val="single" w:sz="4" w:space="0" w:color="000000"/>
-          <w:left w:val="single" w:sz="4" w:space="0" w:color="000000"/>
-          <w:bottom w:val="single" w:sz="4" w:space="0" w:color="000000"/>
-          <w:right w:val="single" w:sz="4" w:space="0" w:color="000000"/>
-          <w:insideH w:val="single" w:sz="4" w:space="0" w:color="000000"/>
-          <w:insideV w:val="single" w:sz="4" w:space="0" w:color="000000"/>
-        </w:tblBorders>
       </w:tblPr>
       <w:tblGrid>
         <w:gridCol w:w="4320"/>
@@ -107,7 +106,7 @@
       <w:tr>
         <w:tc>
           <w:tcPr>
-            <w:tcW w:type="dxa" w:w="4536"/>
+            <w:tcW w:type="dxa" w:w="4320"/>
             <w:shd w:fill="D9E2F3" w:val="clear"/>
           </w:tcPr>
           <w:p>
@@ -123,7 +122,7 @@
         </w:tc>
         <w:tc>
           <w:tcPr>
-            <w:tcW w:type="dxa" w:w="4536"/>
+            <w:tcW w:type="dxa" w:w="4320"/>
             <w:shd w:fill="D9E2F3" w:val="clear"/>
           </w:tcPr>
           <w:p>
@@ -141,8 +140,7 @@
       <w:tr>
         <w:tc>
           <w:tcPr>
-            <w:tcW w:type="dxa" w:w="4536"/>
-            <w:shd w:fill="F2F2F2" w:val="clear"/>
+            <w:tcW w:type="dxa" w:w="4320"/>
           </w:tcPr>
           <w:p>
             <w:r/>
@@ -156,8 +154,7 @@
         </w:tc>
         <w:tc>
           <w:tcPr>
-            <w:tcW w:type="dxa" w:w="4536"/>
-            <w:shd w:fill="F2F2F2" w:val="clear"/>
+            <w:tcW w:type="dxa" w:w="4320"/>
           </w:tcPr>
           <w:p>
             <w:r/>
@@ -173,7 +170,7 @@
       <w:tr>
         <w:tc>
           <w:tcPr>
-            <w:tcW w:type="dxa" w:w="4536"/>
+            <w:tcW w:type="dxa" w:w="4320"/>
           </w:tcPr>
           <w:p>
             <w:r/>
@@ -187,7 +184,7 @@
         </w:tc>
         <w:tc>
           <w:tcPr>
-            <w:tcW w:type="dxa" w:w="4536"/>
+            <w:tcW w:type="dxa" w:w="4320"/>
           </w:tcPr>
           <w:p>
             <w:r/>
@@ -203,8 +200,7 @@
       <w:tr>
         <w:tc>
           <w:tcPr>
-            <w:tcW w:type="dxa" w:w="4536"/>
-            <w:shd w:fill="F2F2F2" w:val="clear"/>
+            <w:tcW w:type="dxa" w:w="4320"/>
           </w:tcPr>
           <w:p>
             <w:r/>
@@ -218,8 +214,7 @@
         </w:tc>
         <w:tc>
           <w:tcPr>
-            <w:tcW w:type="dxa" w:w="4536"/>
-            <w:shd w:fill="F2F2F2" w:val="clear"/>
+            <w:tcW w:type="dxa" w:w="4320"/>
           </w:tcPr>
           <w:p>
             <w:r/>
@@ -235,7 +230,7 @@
       <w:tr>
         <w:tc>
           <w:tcPr>
-            <w:tcW w:type="dxa" w:w="4536"/>
+            <w:tcW w:type="dxa" w:w="4320"/>
           </w:tcPr>
           <w:p>
             <w:r/>
@@ -249,7 +244,7 @@
         </w:tc>
         <w:tc>
           <w:tcPr>
-            <w:tcW w:type="dxa" w:w="4536"/>
+            <w:tcW w:type="dxa" w:w="4320"/>
           </w:tcPr>
           <w:p>
             <w:r/>
@@ -265,8 +260,7 @@
       <w:tr>
         <w:tc>
           <w:tcPr>
-            <w:tcW w:type="dxa" w:w="4536"/>
-            <w:shd w:fill="F2F2F2" w:val="clear"/>
+            <w:tcW w:type="dxa" w:w="4320"/>
           </w:tcPr>
           <w:p>
             <w:r/>
@@ -280,8 +274,7 @@
         </w:tc>
         <w:tc>
           <w:tcPr>
-            <w:tcW w:type="dxa" w:w="4536"/>
-            <w:shd w:fill="F2F2F2" w:val="clear"/>
+            <w:tcW w:type="dxa" w:w="4320"/>
           </w:tcPr>
           <w:p>
             <w:r/>
@@ -307,8 +300,6 @@
     <w:p>
       <w:pPr>
         <w:pStyle w:val="ListBullet"/>
-        <w:spacing w:after="40" w:before="20"/>
-        <w:ind w:left="360"/>
       </w:pPr>
       <w:r>
         <w:t>《南信猫友记——需求规格说明书》</w:t>
@@ -317,12 +308,18 @@
     <w:p>
       <w:pPr>
         <w:pStyle w:val="ListBullet"/>
-        <w:spacing w:after="40" w:before="20"/>
-        <w:ind w:left="360"/>
       </w:pPr>
       <w:r>
         <w:t>《南信猫友记——概要设计说明书》</w:t>
       </w:r>
+    </w:p>
+    <w:p>
+      <w:pPr>
+        <w:spacing w:before="120" w:after="120"/>
+        <w:pBdr>
+          <w:bottom w:val="single" w:sz="6" w:space="1" w:color="999999"/>
+        </w:pBdr>
+      </w:pPr>
     </w:p>
     <w:p>
       <w:pPr>
@@ -363,12 +360,13 @@
     </w:p>
     <w:p>
       <w:pPr>
-        <w:ind w:left="360"/>
+        <w:pStyle w:val="NoSpacing"/>
+        <w:shd w:fill="F2F2F2" w:val="clear"/>
       </w:pPr>
       <w:r>
         <w:rPr>
-          <w:rFonts w:ascii="Courier New" w:hAnsi="Courier New"/>
-          <w:color w:val="2D2D2D"/>
+          <w:rFonts w:ascii="Consolas" w:hAnsi="Consolas"/>
+          <w:color w:val="333333"/>
           <w:sz w:val="18"/>
         </w:rPr>
         <w:t>nanxin-catbook-backend/</w:t>
@@ -432,7 +430,6 @@
         <w:t>└── util/                # 工具类</w:t>
       </w:r>
     </w:p>
-    <w:p/>
     <w:p>
       <w:pPr>
         <w:pStyle w:val="Heading4"/>
@@ -443,12 +440,13 @@
     </w:p>
     <w:p>
       <w:pPr>
-        <w:ind w:left="360"/>
+        <w:pStyle w:val="NoSpacing"/>
+        <w:shd w:fill="F2F2F2" w:val="clear"/>
       </w:pPr>
       <w:r>
         <w:rPr>
-          <w:rFonts w:ascii="Courier New" w:hAnsi="Courier New"/>
-          <w:color w:val="2D2D2D"/>
+          <w:rFonts w:ascii="Consolas" w:hAnsi="Consolas"/>
+          <w:color w:val="333333"/>
           <w:sz w:val="18"/>
         </w:rPr>
         <w:t>frontend/src/</w:t>
@@ -488,7 +486,14 @@
         <w:t>└── style.css                # 全局样式系统</w:t>
       </w:r>
     </w:p>
-    <w:p/>
+    <w:p>
+      <w:pPr>
+        <w:spacing w:before="120" w:after="120"/>
+        <w:pBdr>
+          <w:bottom w:val="single" w:sz="6" w:space="1" w:color="999999"/>
+        </w:pBdr>
+      </w:pPr>
+    </w:p>
     <w:p>
       <w:pPr>
         <w:pStyle w:val="Heading2"/>
@@ -496,6 +501,14 @@
       <w:r>
         <w:t>3. 程序描述（逐模块）</w:t>
       </w:r>
+    </w:p>
+    <w:p>
+      <w:pPr>
+        <w:spacing w:before="120" w:after="120"/>
+        <w:pBdr>
+          <w:bottom w:val="single" w:sz="6" w:space="1" w:color="999999"/>
+        </w:pBdr>
+      </w:pPr>
     </w:p>
     <w:p>
       <w:pPr>
@@ -542,8 +555,6 @@
     <w:p>
       <w:pPr>
         <w:pStyle w:val="ListBullet"/>
-        <w:spacing w:after="40" w:before="20"/>
-        <w:ind w:left="360"/>
       </w:pPr>
       <w:r>
         <w:t>注册：用户名（username）、密码（password）、邮箱（email）</w:t>
@@ -552,8 +563,6 @@
     <w:p>
       <w:pPr>
         <w:pStyle w:val="ListBullet"/>
-        <w:spacing w:after="40" w:before="20"/>
-        <w:ind w:left="360"/>
       </w:pPr>
       <w:r>
         <w:t>登录：用户名、密码</w:t>
@@ -562,8 +571,6 @@
     <w:p>
       <w:pPr>
         <w:pStyle w:val="ListBullet"/>
-        <w:spacing w:after="40" w:before="20"/>
-        <w:ind w:left="360"/>
       </w:pPr>
       <w:r>
         <w:t>获取/更新个人信息：JWT Token</w:t>
@@ -580,8 +587,6 @@
     <w:p>
       <w:pPr>
         <w:pStyle w:val="ListBullet"/>
-        <w:spacing w:after="40" w:before="20"/>
-        <w:ind w:left="360"/>
       </w:pPr>
       <w:r>
         <w:t>注册/登录成功：JWT Token + 用户基本信息</w:t>
@@ -590,8 +595,6 @@
     <w:p>
       <w:pPr>
         <w:pStyle w:val="ListBullet"/>
-        <w:spacing w:after="40" w:before="20"/>
-        <w:ind w:left="360"/>
       </w:pPr>
       <w:r>
         <w:t>个人信息：用户 ID、用户名、昵称、邮箱、头像、角色</w:t>
@@ -608,8 +611,6 @@
     <w:p>
       <w:pPr>
         <w:pStyle w:val="ListBullet"/>
-        <w:spacing w:after="40" w:before="20"/>
-        <w:ind w:left="360"/>
       </w:pPr>
       <w:r>
         <w:t>密码加密：BCrypt 哈希算法（`BCryptPasswordEncoder.encode()`）</w:t>
@@ -618,8 +619,6 @@
     <w:p>
       <w:pPr>
         <w:pStyle w:val="ListBullet"/>
-        <w:spacing w:after="40" w:before="20"/>
-        <w:ind w:left="360"/>
       </w:pPr>
       <w:r>
         <w:t>Token 生成：HMAC-SHA256 签名 JWT，有效期 24 小时</w:t>
@@ -635,12 +634,13 @@
     </w:p>
     <w:p>
       <w:pPr>
-        <w:ind w:left="360"/>
+        <w:pStyle w:val="NoSpacing"/>
+        <w:shd w:fill="F2F2F2" w:val="clear"/>
       </w:pPr>
       <w:r>
         <w:rPr>
-          <w:rFonts w:ascii="Courier New" w:hAnsi="Courier New"/>
-          <w:color w:val="2D2D2D"/>
+          <w:rFonts w:ascii="Consolas" w:hAnsi="Consolas"/>
+          <w:color w:val="333333"/>
           <w:sz w:val="18"/>
         </w:rPr>
         <w:t>POST /auth/register</w:t>
@@ -674,7 +674,45 @@
         <w:t xml:space="preserve">  3. 查询并返回用户信息</w:t>
       </w:r>
     </w:p>
-    <w:p/>
+    <w:p>
+      <w:pPr>
+        <w:jc w:val="center"/>
+      </w:pPr>
+      <w:r>
+        <w:drawing>
+          <wp:inline xmlns:a="http://schemas.openxmlformats.org/drawingml/2006/main" xmlns:pic="http://schemas.openxmlformats.org/drawingml/2006/picture">
+            <wp:extent cx="5029200" cy="5029200"/>
+            <wp:docPr id="1" name="Picture 1"/>
+            <wp:cNvGraphicFramePr>
+              <a:graphicFrameLocks noChangeAspect="1"/>
+            </wp:cNvGraphicFramePr>
+            <a:graphic>
+              <a:graphicData uri="http://schemas.openxmlformats.org/drawingml/2006/picture">
+                <pic:pic>
+                  <pic:nvPicPr>
+                    <pic:cNvPr id="0" name="tmpzy6i2q9h.png"/>
+                    <pic:cNvPicPr/>
+                  </pic:nvPicPr>
+                  <pic:blipFill>
+                    <a:blip r:embed="rId9"/>
+                    <a:stretch>
+                      <a:fillRect/>
+                    </a:stretch>
+                  </pic:blipFill>
+                  <pic:spPr>
+                    <a:xfrm>
+                      <a:off x="0" y="0"/>
+                      <a:ext cx="5029200" cy="5029200"/>
+                    </a:xfrm>
+                    <a:prstGeom prst="rect"/>
+                  </pic:spPr>
+                </pic:pic>
+              </a:graphicData>
+            </a:graphic>
+          </wp:inline>
+        </w:drawing>
+      </w:r>
+    </w:p>
     <w:p>
       <w:pPr>
         <w:pStyle w:val="Heading4"/>
@@ -685,17 +723,10 @@
     </w:p>
     <w:tbl>
       <w:tblPr>
+        <w:tblStyle w:val="TableGrid"/>
         <w:tblW w:type="auto" w:w="0"/>
         <w:jc w:val="center"/>
         <w:tblLook w:firstColumn="1" w:firstRow="1" w:lastColumn="0" w:lastRow="0" w:noHBand="0" w:noVBand="1" w:val="04A0"/>
-        <w:tblBorders>
-          <w:top w:val="single" w:sz="4" w:space="0" w:color="000000"/>
-          <w:left w:val="single" w:sz="4" w:space="0" w:color="000000"/>
-          <w:bottom w:val="single" w:sz="4" w:space="0" w:color="000000"/>
-          <w:right w:val="single" w:sz="4" w:space="0" w:color="000000"/>
-          <w:insideH w:val="single" w:sz="4" w:space="0" w:color="000000"/>
-          <w:insideV w:val="single" w:sz="4" w:space="0" w:color="000000"/>
-        </w:tblBorders>
       </w:tblPr>
       <w:tblGrid>
         <w:gridCol w:w="2880"/>
@@ -705,7 +736,7 @@
       <w:tr>
         <w:tc>
           <w:tcPr>
-            <w:tcW w:type="dxa" w:w="3024"/>
+            <w:tcW w:type="dxa" w:w="2880"/>
             <w:shd w:fill="D9E2F3" w:val="clear"/>
           </w:tcPr>
           <w:p>
@@ -721,7 +752,7 @@
         </w:tc>
         <w:tc>
           <w:tcPr>
-            <w:tcW w:type="dxa" w:w="3024"/>
+            <w:tcW w:type="dxa" w:w="2880"/>
             <w:shd w:fill="D9E2F3" w:val="clear"/>
           </w:tcPr>
           <w:p>
@@ -737,7 +768,7 @@
         </w:tc>
         <w:tc>
           <w:tcPr>
-            <w:tcW w:type="dxa" w:w="3024"/>
+            <w:tcW w:type="dxa" w:w="2880"/>
             <w:shd w:fill="D9E2F3" w:val="clear"/>
           </w:tcPr>
           <w:p>
@@ -755,8 +786,7 @@
       <w:tr>
         <w:tc>
           <w:tcPr>
-            <w:tcW w:type="dxa" w:w="3024"/>
-            <w:shd w:fill="F2F2F2" w:val="clear"/>
+            <w:tcW w:type="dxa" w:w="2880"/>
           </w:tcPr>
           <w:p>
             <w:r/>
@@ -770,8 +800,7 @@
         </w:tc>
         <w:tc>
           <w:tcPr>
-            <w:tcW w:type="dxa" w:w="3024"/>
-            <w:shd w:fill="F2F2F2" w:val="clear"/>
+            <w:tcW w:type="dxa" w:w="2880"/>
           </w:tcPr>
           <w:p>
             <w:r/>
@@ -785,8 +814,7 @@
         </w:tc>
         <w:tc>
           <w:tcPr>
-            <w:tcW w:type="dxa" w:w="3024"/>
-            <w:shd w:fill="F2F2F2" w:val="clear"/>
+            <w:tcW w:type="dxa" w:w="2880"/>
           </w:tcPr>
           <w:p>
             <w:r/>
@@ -802,7 +830,7 @@
       <w:tr>
         <w:tc>
           <w:tcPr>
-            <w:tcW w:type="dxa" w:w="3024"/>
+            <w:tcW w:type="dxa" w:w="2880"/>
           </w:tcPr>
           <w:p>
             <w:r/>
@@ -816,7 +844,7 @@
         </w:tc>
         <w:tc>
           <w:tcPr>
-            <w:tcW w:type="dxa" w:w="3024"/>
+            <w:tcW w:type="dxa" w:w="2880"/>
           </w:tcPr>
           <w:p>
             <w:r/>
@@ -830,7 +858,7 @@
         </w:tc>
         <w:tc>
           <w:tcPr>
-            <w:tcW w:type="dxa" w:w="3024"/>
+            <w:tcW w:type="dxa" w:w="2880"/>
           </w:tcPr>
           <w:p>
             <w:r/>
@@ -846,8 +874,7 @@
       <w:tr>
         <w:tc>
           <w:tcPr>
-            <w:tcW w:type="dxa" w:w="3024"/>
-            <w:shd w:fill="F2F2F2" w:val="clear"/>
+            <w:tcW w:type="dxa" w:w="2880"/>
           </w:tcPr>
           <w:p>
             <w:r/>
@@ -861,8 +888,7 @@
         </w:tc>
         <w:tc>
           <w:tcPr>
-            <w:tcW w:type="dxa" w:w="3024"/>
-            <w:shd w:fill="F2F2F2" w:val="clear"/>
+            <w:tcW w:type="dxa" w:w="2880"/>
           </w:tcPr>
           <w:p>
             <w:r/>
@@ -876,8 +902,7 @@
         </w:tc>
         <w:tc>
           <w:tcPr>
-            <w:tcW w:type="dxa" w:w="3024"/>
-            <w:shd w:fill="F2F2F2" w:val="clear"/>
+            <w:tcW w:type="dxa" w:w="2880"/>
           </w:tcPr>
           <w:p>
             <w:r/>
@@ -893,7 +918,7 @@
       <w:tr>
         <w:tc>
           <w:tcPr>
-            <w:tcW w:type="dxa" w:w="3024"/>
+            <w:tcW w:type="dxa" w:w="2880"/>
           </w:tcPr>
           <w:p>
             <w:r/>
@@ -907,7 +932,7 @@
         </w:tc>
         <w:tc>
           <w:tcPr>
-            <w:tcW w:type="dxa" w:w="3024"/>
+            <w:tcW w:type="dxa" w:w="2880"/>
           </w:tcPr>
           <w:p>
             <w:r/>
@@ -921,7 +946,7 @@
         </w:tc>
         <w:tc>
           <w:tcPr>
-            <w:tcW w:type="dxa" w:w="3024"/>
+            <w:tcW w:type="dxa" w:w="2880"/>
           </w:tcPr>
           <w:p>
             <w:r/>
@@ -938,6 +963,14 @@
     <w:p/>
     <w:p>
       <w:pPr>
+        <w:spacing w:before="120" w:after="120"/>
+        <w:pBdr>
+          <w:bottom w:val="single" w:sz="6" w:space="1" w:color="999999"/>
+        </w:pBdr>
+      </w:pPr>
+    </w:p>
+    <w:p>
+      <w:pPr>
         <w:pStyle w:val="Heading3"/>
       </w:pPr>
       <w:r>
@@ -1001,17 +1034,18 @@
         <w:pStyle w:val="Heading4"/>
       </w:pPr>
       <w:r>
-        <w:t>3.4.5 程序逻辑</w:t>
+        <w:t>3.2.5 程序逻辑</w:t>
       </w:r>
     </w:p>
     <w:p>
       <w:pPr>
-        <w:ind w:left="360"/>
+        <w:pStyle w:val="NoSpacing"/>
+        <w:shd w:fill="F2F2F2" w:val="clear"/>
       </w:pPr>
       <w:r>
         <w:rPr>
-          <w:rFonts w:ascii="Courier New" w:hAnsi="Courier New"/>
-          <w:color w:val="2D2D2D"/>
+          <w:rFonts w:ascii="Consolas" w:hAnsi="Consolas"/>
+          <w:color w:val="333333"/>
           <w:sz w:val="18"/>
         </w:rPr>
         <w:t>POST /cats</w:t>
@@ -1043,7 +1077,45 @@
         <w:t xml:space="preserve">  3. 逻辑删除或物理删除猫咪记录</w:t>
       </w:r>
     </w:p>
-    <w:p/>
+    <w:p>
+      <w:pPr>
+        <w:jc w:val="center"/>
+      </w:pPr>
+      <w:r>
+        <w:drawing>
+          <wp:inline xmlns:a="http://schemas.openxmlformats.org/drawingml/2006/main" xmlns:pic="http://schemas.openxmlformats.org/drawingml/2006/picture">
+            <wp:extent cx="5029200" cy="5364480"/>
+            <wp:docPr id="2" name="Picture 2"/>
+            <wp:cNvGraphicFramePr>
+              <a:graphicFrameLocks noChangeAspect="1"/>
+            </wp:cNvGraphicFramePr>
+            <a:graphic>
+              <a:graphicData uri="http://schemas.openxmlformats.org/drawingml/2006/picture">
+                <pic:pic>
+                  <pic:nvPicPr>
+                    <pic:cNvPr id="0" name="tmp_j4a772j.png"/>
+                    <pic:cNvPicPr/>
+                  </pic:nvPicPr>
+                  <pic:blipFill>
+                    <a:blip r:embed="rId10"/>
+                    <a:stretch>
+                      <a:fillRect/>
+                    </a:stretch>
+                  </pic:blipFill>
+                  <pic:spPr>
+                    <a:xfrm>
+                      <a:off x="0" y="0"/>
+                      <a:ext cx="5029200" cy="5364480"/>
+                    </a:xfrm>
+                    <a:prstGeom prst="rect"/>
+                  </pic:spPr>
+                </pic:pic>
+              </a:graphicData>
+            </a:graphic>
+          </wp:inline>
+        </w:drawing>
+      </w:r>
+    </w:p>
     <w:p>
       <w:pPr>
         <w:pStyle w:val="Heading4"/>
@@ -1054,17 +1126,10 @@
     </w:p>
     <w:tbl>
       <w:tblPr>
+        <w:tblStyle w:val="TableGrid"/>
         <w:tblW w:type="auto" w:w="0"/>
         <w:jc w:val="center"/>
         <w:tblLook w:firstColumn="1" w:firstRow="1" w:lastColumn="0" w:lastRow="0" w:noHBand="0" w:noVBand="1" w:val="04A0"/>
-        <w:tblBorders>
-          <w:top w:val="single" w:sz="4" w:space="0" w:color="000000"/>
-          <w:left w:val="single" w:sz="4" w:space="0" w:color="000000"/>
-          <w:bottom w:val="single" w:sz="4" w:space="0" w:color="000000"/>
-          <w:right w:val="single" w:sz="4" w:space="0" w:color="000000"/>
-          <w:insideH w:val="single" w:sz="4" w:space="0" w:color="000000"/>
-          <w:insideV w:val="single" w:sz="4" w:space="0" w:color="000000"/>
-        </w:tblBorders>
       </w:tblPr>
       <w:tblGrid>
         <w:gridCol w:w="2880"/>
@@ -1074,7 +1139,7 @@
       <w:tr>
         <w:tc>
           <w:tcPr>
-            <w:tcW w:type="dxa" w:w="3024"/>
+            <w:tcW w:type="dxa" w:w="2880"/>
             <w:shd w:fill="D9E2F3" w:val="clear"/>
           </w:tcPr>
           <w:p>
@@ -1090,7 +1155,7 @@
         </w:tc>
         <w:tc>
           <w:tcPr>
-            <w:tcW w:type="dxa" w:w="3024"/>
+            <w:tcW w:type="dxa" w:w="2880"/>
             <w:shd w:fill="D9E2F3" w:val="clear"/>
           </w:tcPr>
           <w:p>
@@ -1106,7 +1171,7 @@
         </w:tc>
         <w:tc>
           <w:tcPr>
-            <w:tcW w:type="dxa" w:w="3024"/>
+            <w:tcW w:type="dxa" w:w="2880"/>
             <w:shd w:fill="D9E2F3" w:val="clear"/>
           </w:tcPr>
           <w:p>
@@ -1124,8 +1189,7 @@
       <w:tr>
         <w:tc>
           <w:tcPr>
-            <w:tcW w:type="dxa" w:w="3024"/>
-            <w:shd w:fill="F2F2F2" w:val="clear"/>
+            <w:tcW w:type="dxa" w:w="2880"/>
           </w:tcPr>
           <w:p>
             <w:r/>
@@ -1139,8 +1203,7 @@
         </w:tc>
         <w:tc>
           <w:tcPr>
-            <w:tcW w:type="dxa" w:w="3024"/>
-            <w:shd w:fill="F2F2F2" w:val="clear"/>
+            <w:tcW w:type="dxa" w:w="2880"/>
           </w:tcPr>
           <w:p>
             <w:r/>
@@ -1154,8 +1217,7 @@
         </w:tc>
         <w:tc>
           <w:tcPr>
-            <w:tcW w:type="dxa" w:w="3024"/>
-            <w:shd w:fill="F2F2F2" w:val="clear"/>
+            <w:tcW w:type="dxa" w:w="2880"/>
           </w:tcPr>
           <w:p>
             <w:r/>
@@ -1171,7 +1233,7 @@
       <w:tr>
         <w:tc>
           <w:tcPr>
-            <w:tcW w:type="dxa" w:w="3024"/>
+            <w:tcW w:type="dxa" w:w="2880"/>
           </w:tcPr>
           <w:p>
             <w:r/>
@@ -1185,7 +1247,7 @@
         </w:tc>
         <w:tc>
           <w:tcPr>
-            <w:tcW w:type="dxa" w:w="3024"/>
+            <w:tcW w:type="dxa" w:w="2880"/>
           </w:tcPr>
           <w:p>
             <w:r/>
@@ -1199,7 +1261,7 @@
         </w:tc>
         <w:tc>
           <w:tcPr>
-            <w:tcW w:type="dxa" w:w="3024"/>
+            <w:tcW w:type="dxa" w:w="2880"/>
           </w:tcPr>
           <w:p>
             <w:r/>
@@ -1215,8 +1277,7 @@
       <w:tr>
         <w:tc>
           <w:tcPr>
-            <w:tcW w:type="dxa" w:w="3024"/>
-            <w:shd w:fill="F2F2F2" w:val="clear"/>
+            <w:tcW w:type="dxa" w:w="2880"/>
           </w:tcPr>
           <w:p>
             <w:r/>
@@ -1230,8 +1291,7 @@
         </w:tc>
         <w:tc>
           <w:tcPr>
-            <w:tcW w:type="dxa" w:w="3024"/>
-            <w:shd w:fill="F2F2F2" w:val="clear"/>
+            <w:tcW w:type="dxa" w:w="2880"/>
           </w:tcPr>
           <w:p>
             <w:r/>
@@ -1245,8 +1305,7 @@
         </w:tc>
         <w:tc>
           <w:tcPr>
-            <w:tcW w:type="dxa" w:w="3024"/>
-            <w:shd w:fill="F2F2F2" w:val="clear"/>
+            <w:tcW w:type="dxa" w:w="2880"/>
           </w:tcPr>
           <w:p>
             <w:r/>
@@ -1262,7 +1321,7 @@
       <w:tr>
         <w:tc>
           <w:tcPr>
-            <w:tcW w:type="dxa" w:w="3024"/>
+            <w:tcW w:type="dxa" w:w="2880"/>
           </w:tcPr>
           <w:p>
             <w:r/>
@@ -1276,7 +1335,7 @@
         </w:tc>
         <w:tc>
           <w:tcPr>
-            <w:tcW w:type="dxa" w:w="3024"/>
+            <w:tcW w:type="dxa" w:w="2880"/>
           </w:tcPr>
           <w:p>
             <w:r/>
@@ -1290,7 +1349,7 @@
         </w:tc>
         <w:tc>
           <w:tcPr>
-            <w:tcW w:type="dxa" w:w="3024"/>
+            <w:tcW w:type="dxa" w:w="2880"/>
           </w:tcPr>
           <w:p>
             <w:r/>
@@ -1306,8 +1365,7 @@
       <w:tr>
         <w:tc>
           <w:tcPr>
-            <w:tcW w:type="dxa" w:w="3024"/>
-            <w:shd w:fill="F2F2F2" w:val="clear"/>
+            <w:tcW w:type="dxa" w:w="2880"/>
           </w:tcPr>
           <w:p>
             <w:r/>
@@ -1321,8 +1379,7 @@
         </w:tc>
         <w:tc>
           <w:tcPr>
-            <w:tcW w:type="dxa" w:w="3024"/>
-            <w:shd w:fill="F2F2F2" w:val="clear"/>
+            <w:tcW w:type="dxa" w:w="2880"/>
           </w:tcPr>
           <w:p>
             <w:r/>
@@ -1336,8 +1393,7 @@
         </w:tc>
         <w:tc>
           <w:tcPr>
-            <w:tcW w:type="dxa" w:w="3024"/>
-            <w:shd w:fill="F2F2F2" w:val="clear"/>
+            <w:tcW w:type="dxa" w:w="2880"/>
           </w:tcPr>
           <w:p>
             <w:r/>
@@ -1354,6 +1410,14 @@
     <w:p/>
     <w:p>
       <w:pPr>
+        <w:spacing w:before="120" w:after="120"/>
+        <w:pBdr>
+          <w:bottom w:val="single" w:sz="6" w:space="1" w:color="999999"/>
+        </w:pBdr>
+      </w:pPr>
+    </w:p>
+    <w:p>
+      <w:pPr>
         <w:pStyle w:val="Heading3"/>
       </w:pPr>
       <w:r>
@@ -1422,12 +1486,13 @@
     </w:p>
     <w:p>
       <w:pPr>
-        <w:ind w:left="360"/>
+        <w:pStyle w:val="NoSpacing"/>
+        <w:shd w:fill="F2F2F2" w:val="clear"/>
       </w:pPr>
       <w:r>
         <w:rPr>
-          <w:rFonts w:ascii="Courier New" w:hAnsi="Courier New"/>
-          <w:color w:val="2D2D2D"/>
+          <w:rFonts w:ascii="Consolas" w:hAnsi="Consolas"/>
+          <w:color w:val="333333"/>
           <w:sz w:val="18"/>
         </w:rPr>
         <w:t>GET /cats?status=active&amp;page=1&amp;size=20</w:t>
@@ -1454,7 +1519,45 @@
         <w:t xml:space="preserve">  - 重新按 status 发起列表请求</w:t>
       </w:r>
     </w:p>
-    <w:p/>
+    <w:p>
+      <w:pPr>
+        <w:jc w:val="center"/>
+      </w:pPr>
+      <w:r>
+        <w:drawing>
+          <wp:inline xmlns:a="http://schemas.openxmlformats.org/drawingml/2006/main" xmlns:pic="http://schemas.openxmlformats.org/drawingml/2006/picture">
+            <wp:extent cx="5029200" cy="5448300"/>
+            <wp:docPr id="3" name="Picture 3"/>
+            <wp:cNvGraphicFramePr>
+              <a:graphicFrameLocks noChangeAspect="1"/>
+            </wp:cNvGraphicFramePr>
+            <a:graphic>
+              <a:graphicData uri="http://schemas.openxmlformats.org/drawingml/2006/picture">
+                <pic:pic>
+                  <pic:nvPicPr>
+                    <pic:cNvPr id="0" name="tmppluqvuq7.png"/>
+                    <pic:cNvPicPr/>
+                  </pic:nvPicPr>
+                  <pic:blipFill>
+                    <a:blip r:embed="rId11"/>
+                    <a:stretch>
+                      <a:fillRect/>
+                    </a:stretch>
+                  </pic:blipFill>
+                  <pic:spPr>
+                    <a:xfrm>
+                      <a:off x="0" y="0"/>
+                      <a:ext cx="5029200" cy="5448300"/>
+                    </a:xfrm>
+                    <a:prstGeom prst="rect"/>
+                  </pic:spPr>
+                </pic:pic>
+              </a:graphicData>
+            </a:graphic>
+          </wp:inline>
+        </w:drawing>
+      </w:r>
+    </w:p>
     <w:p>
       <w:pPr>
         <w:pStyle w:val="Heading4"/>
@@ -1465,17 +1568,10 @@
     </w:p>
     <w:tbl>
       <w:tblPr>
+        <w:tblStyle w:val="TableGrid"/>
         <w:tblW w:type="auto" w:w="0"/>
         <w:jc w:val="center"/>
         <w:tblLook w:firstColumn="1" w:firstRow="1" w:lastColumn="0" w:lastRow="0" w:noHBand="0" w:noVBand="1" w:val="04A0"/>
-        <w:tblBorders>
-          <w:top w:val="single" w:sz="4" w:space="0" w:color="000000"/>
-          <w:left w:val="single" w:sz="4" w:space="0" w:color="000000"/>
-          <w:bottom w:val="single" w:sz="4" w:space="0" w:color="000000"/>
-          <w:right w:val="single" w:sz="4" w:space="0" w:color="000000"/>
-          <w:insideH w:val="single" w:sz="4" w:space="0" w:color="000000"/>
-          <w:insideV w:val="single" w:sz="4" w:space="0" w:color="000000"/>
-        </w:tblBorders>
       </w:tblPr>
       <w:tblGrid>
         <w:gridCol w:w="2880"/>
@@ -1485,7 +1581,7 @@
       <w:tr>
         <w:tc>
           <w:tcPr>
-            <w:tcW w:type="dxa" w:w="3024"/>
+            <w:tcW w:type="dxa" w:w="2880"/>
             <w:shd w:fill="D9E2F3" w:val="clear"/>
           </w:tcPr>
           <w:p>
@@ -1501,7 +1597,7 @@
         </w:tc>
         <w:tc>
           <w:tcPr>
-            <w:tcW w:type="dxa" w:w="3024"/>
+            <w:tcW w:type="dxa" w:w="2880"/>
             <w:shd w:fill="D9E2F3" w:val="clear"/>
           </w:tcPr>
           <w:p>
@@ -1517,7 +1613,7 @@
         </w:tc>
         <w:tc>
           <w:tcPr>
-            <w:tcW w:type="dxa" w:w="3024"/>
+            <w:tcW w:type="dxa" w:w="2880"/>
             <w:shd w:fill="D9E2F3" w:val="clear"/>
           </w:tcPr>
           <w:p>
@@ -1535,8 +1631,7 @@
       <w:tr>
         <w:tc>
           <w:tcPr>
-            <w:tcW w:type="dxa" w:w="3024"/>
-            <w:shd w:fill="F2F2F2" w:val="clear"/>
+            <w:tcW w:type="dxa" w:w="2880"/>
           </w:tcPr>
           <w:p>
             <w:r/>
@@ -1550,8 +1645,7 @@
         </w:tc>
         <w:tc>
           <w:tcPr>
-            <w:tcW w:type="dxa" w:w="3024"/>
-            <w:shd w:fill="F2F2F2" w:val="clear"/>
+            <w:tcW w:type="dxa" w:w="2880"/>
           </w:tcPr>
           <w:p>
             <w:r/>
@@ -1565,8 +1659,7 @@
         </w:tc>
         <w:tc>
           <w:tcPr>
-            <w:tcW w:type="dxa" w:w="3024"/>
-            <w:shd w:fill="F2F2F2" w:val="clear"/>
+            <w:tcW w:type="dxa" w:w="2880"/>
           </w:tcPr>
           <w:p>
             <w:r/>
@@ -1583,6 +1676,14 @@
     <w:p/>
     <w:p>
       <w:pPr>
+        <w:spacing w:before="120" w:after="120"/>
+        <w:pBdr>
+          <w:bottom w:val="single" w:sz="6" w:space="1" w:color="999999"/>
+        </w:pBdr>
+      </w:pPr>
+    </w:p>
+    <w:p>
+      <w:pPr>
         <w:pStyle w:val="Heading3"/>
       </w:pPr>
       <w:r>
@@ -1626,8 +1727,6 @@
     <w:p>
       <w:pPr>
         <w:pStyle w:val="ListBullet"/>
-        <w:spacing w:after="40" w:before="20"/>
-        <w:ind w:left="360"/>
       </w:pPr>
       <w:r>
         <w:t>上传：图片文件（支持 jpg/png，最大 10MB）、猫咪 ID、照片描述</w:t>
@@ -1636,8 +1735,6 @@
     <w:p>
       <w:pPr>
         <w:pStyle w:val="ListBullet"/>
-        <w:spacing w:after="40" w:before="20"/>
-        <w:ind w:left="360"/>
       </w:pPr>
       <w:r>
         <w:t>审核：照片 ID、审核结果（approve/reject）、拒绝原因</w:t>
@@ -1646,8 +1743,6 @@
     <w:p>
       <w:pPr>
         <w:pStyle w:val="ListBullet"/>
-        <w:spacing w:after="40" w:before="20"/>
-        <w:ind w:left="360"/>
       </w:pPr>
       <w:r>
         <w:t>点赞：照片 ID</w:t>
@@ -1676,12 +1771,13 @@
     </w:p>
     <w:p>
       <w:pPr>
-        <w:ind w:left="360"/>
+        <w:pStyle w:val="NoSpacing"/>
+        <w:shd w:fill="F2F2F2" w:val="clear"/>
       </w:pPr>
       <w:r>
         <w:rPr>
-          <w:rFonts w:ascii="Courier New" w:hAnsi="Courier New"/>
-          <w:color w:val="2D2D2D"/>
+          <w:rFonts w:ascii="Consolas" w:hAnsi="Consolas"/>
+          <w:color w:val="333333"/>
           <w:sz w:val="18"/>
         </w:rPr>
         <w:t>POST /cats/{catId}/photos</w:t>
@@ -1715,7 +1811,45 @@
         <w:t xml:space="preserve">  4. 递增 photo.like_count（冗余计数字段）</w:t>
       </w:r>
     </w:p>
-    <w:p/>
+    <w:p>
+      <w:pPr>
+        <w:jc w:val="center"/>
+      </w:pPr>
+      <w:r>
+        <w:drawing>
+          <wp:inline xmlns:a="http://schemas.openxmlformats.org/drawingml/2006/main" xmlns:pic="http://schemas.openxmlformats.org/drawingml/2006/picture">
+            <wp:extent cx="5029200" cy="5343525"/>
+            <wp:docPr id="4" name="Picture 4"/>
+            <wp:cNvGraphicFramePr>
+              <a:graphicFrameLocks noChangeAspect="1"/>
+            </wp:cNvGraphicFramePr>
+            <a:graphic>
+              <a:graphicData uri="http://schemas.openxmlformats.org/drawingml/2006/picture">
+                <pic:pic>
+                  <pic:nvPicPr>
+                    <pic:cNvPr id="0" name="tmp10fpzqhc.png"/>
+                    <pic:cNvPicPr/>
+                  </pic:nvPicPr>
+                  <pic:blipFill>
+                    <a:blip r:embed="rId12"/>
+                    <a:stretch>
+                      <a:fillRect/>
+                    </a:stretch>
+                  </pic:blipFill>
+                  <pic:spPr>
+                    <a:xfrm>
+                      <a:off x="0" y="0"/>
+                      <a:ext cx="5029200" cy="5343525"/>
+                    </a:xfrm>
+                    <a:prstGeom prst="rect"/>
+                  </pic:spPr>
+                </pic:pic>
+              </a:graphicData>
+            </a:graphic>
+          </wp:inline>
+        </w:drawing>
+      </w:r>
+    </w:p>
     <w:p>
       <w:pPr>
         <w:pStyle w:val="Heading4"/>
@@ -1726,17 +1860,10 @@
     </w:p>
     <w:tbl>
       <w:tblPr>
+        <w:tblStyle w:val="TableGrid"/>
         <w:tblW w:type="auto" w:w="0"/>
         <w:jc w:val="center"/>
         <w:tblLook w:firstColumn="1" w:firstRow="1" w:lastColumn="0" w:lastRow="0" w:noHBand="0" w:noVBand="1" w:val="04A0"/>
-        <w:tblBorders>
-          <w:top w:val="single" w:sz="4" w:space="0" w:color="000000"/>
-          <w:left w:val="single" w:sz="4" w:space="0" w:color="000000"/>
-          <w:bottom w:val="single" w:sz="4" w:space="0" w:color="000000"/>
-          <w:right w:val="single" w:sz="4" w:space="0" w:color="000000"/>
-          <w:insideH w:val="single" w:sz="4" w:space="0" w:color="000000"/>
-          <w:insideV w:val="single" w:sz="4" w:space="0" w:color="000000"/>
-        </w:tblBorders>
       </w:tblPr>
       <w:tblGrid>
         <w:gridCol w:w="2880"/>
@@ -1746,7 +1873,7 @@
       <w:tr>
         <w:tc>
           <w:tcPr>
-            <w:tcW w:type="dxa" w:w="3024"/>
+            <w:tcW w:type="dxa" w:w="2880"/>
             <w:shd w:fill="D9E2F3" w:val="clear"/>
           </w:tcPr>
           <w:p>
@@ -1762,7 +1889,7 @@
         </w:tc>
         <w:tc>
           <w:tcPr>
-            <w:tcW w:type="dxa" w:w="3024"/>
+            <w:tcW w:type="dxa" w:w="2880"/>
             <w:shd w:fill="D9E2F3" w:val="clear"/>
           </w:tcPr>
           <w:p>
@@ -1778,7 +1905,7 @@
         </w:tc>
         <w:tc>
           <w:tcPr>
-            <w:tcW w:type="dxa" w:w="3024"/>
+            <w:tcW w:type="dxa" w:w="2880"/>
             <w:shd w:fill="D9E2F3" w:val="clear"/>
           </w:tcPr>
           <w:p>
@@ -1796,8 +1923,7 @@
       <w:tr>
         <w:tc>
           <w:tcPr>
-            <w:tcW w:type="dxa" w:w="3024"/>
-            <w:shd w:fill="F2F2F2" w:val="clear"/>
+            <w:tcW w:type="dxa" w:w="2880"/>
           </w:tcPr>
           <w:p>
             <w:r/>
@@ -1811,8 +1937,7 @@
         </w:tc>
         <w:tc>
           <w:tcPr>
-            <w:tcW w:type="dxa" w:w="3024"/>
-            <w:shd w:fill="F2F2F2" w:val="clear"/>
+            <w:tcW w:type="dxa" w:w="2880"/>
           </w:tcPr>
           <w:p>
             <w:r/>
@@ -1826,8 +1951,7 @@
         </w:tc>
         <w:tc>
           <w:tcPr>
-            <w:tcW w:type="dxa" w:w="3024"/>
-            <w:shd w:fill="F2F2F2" w:val="clear"/>
+            <w:tcW w:type="dxa" w:w="2880"/>
           </w:tcPr>
           <w:p>
             <w:r/>
@@ -1843,7 +1967,7 @@
       <w:tr>
         <w:tc>
           <w:tcPr>
-            <w:tcW w:type="dxa" w:w="3024"/>
+            <w:tcW w:type="dxa" w:w="2880"/>
           </w:tcPr>
           <w:p>
             <w:r/>
@@ -1857,7 +1981,7 @@
         </w:tc>
         <w:tc>
           <w:tcPr>
-            <w:tcW w:type="dxa" w:w="3024"/>
+            <w:tcW w:type="dxa" w:w="2880"/>
           </w:tcPr>
           <w:p>
             <w:r/>
@@ -1871,7 +1995,7 @@
         </w:tc>
         <w:tc>
           <w:tcPr>
-            <w:tcW w:type="dxa" w:w="3024"/>
+            <w:tcW w:type="dxa" w:w="2880"/>
           </w:tcPr>
           <w:p>
             <w:r/>
@@ -1887,8 +2011,7 @@
       <w:tr>
         <w:tc>
           <w:tcPr>
-            <w:tcW w:type="dxa" w:w="3024"/>
-            <w:shd w:fill="F2F2F2" w:val="clear"/>
+            <w:tcW w:type="dxa" w:w="2880"/>
           </w:tcPr>
           <w:p>
             <w:r/>
@@ -1902,8 +2025,7 @@
         </w:tc>
         <w:tc>
           <w:tcPr>
-            <w:tcW w:type="dxa" w:w="3024"/>
-            <w:shd w:fill="F2F2F2" w:val="clear"/>
+            <w:tcW w:type="dxa" w:w="2880"/>
           </w:tcPr>
           <w:p>
             <w:r/>
@@ -1917,8 +2039,7 @@
         </w:tc>
         <w:tc>
           <w:tcPr>
-            <w:tcW w:type="dxa" w:w="3024"/>
-            <w:shd w:fill="F2F2F2" w:val="clear"/>
+            <w:tcW w:type="dxa" w:w="2880"/>
           </w:tcPr>
           <w:p>
             <w:r/>
@@ -1934,7 +2055,7 @@
       <w:tr>
         <w:tc>
           <w:tcPr>
-            <w:tcW w:type="dxa" w:w="3024"/>
+            <w:tcW w:type="dxa" w:w="2880"/>
           </w:tcPr>
           <w:p>
             <w:r/>
@@ -1948,7 +2069,7 @@
         </w:tc>
         <w:tc>
           <w:tcPr>
-            <w:tcW w:type="dxa" w:w="3024"/>
+            <w:tcW w:type="dxa" w:w="2880"/>
           </w:tcPr>
           <w:p>
             <w:r/>
@@ -1962,7 +2083,7 @@
         </w:tc>
         <w:tc>
           <w:tcPr>
-            <w:tcW w:type="dxa" w:w="3024"/>
+            <w:tcW w:type="dxa" w:w="2880"/>
           </w:tcPr>
           <w:p>
             <w:r/>
@@ -1978,8 +2099,7 @@
       <w:tr>
         <w:tc>
           <w:tcPr>
-            <w:tcW w:type="dxa" w:w="3024"/>
-            <w:shd w:fill="F2F2F2" w:val="clear"/>
+            <w:tcW w:type="dxa" w:w="2880"/>
           </w:tcPr>
           <w:p>
             <w:r/>
@@ -1993,8 +2113,7 @@
         </w:tc>
         <w:tc>
           <w:tcPr>
-            <w:tcW w:type="dxa" w:w="3024"/>
-            <w:shd w:fill="F2F2F2" w:val="clear"/>
+            <w:tcW w:type="dxa" w:w="2880"/>
           </w:tcPr>
           <w:p>
             <w:r/>
@@ -2008,8 +2127,7 @@
         </w:tc>
         <w:tc>
           <w:tcPr>
-            <w:tcW w:type="dxa" w:w="3024"/>
-            <w:shd w:fill="F2F2F2" w:val="clear"/>
+            <w:tcW w:type="dxa" w:w="2880"/>
           </w:tcPr>
           <w:p>
             <w:r/>
@@ -2025,7 +2143,7 @@
       <w:tr>
         <w:tc>
           <w:tcPr>
-            <w:tcW w:type="dxa" w:w="3024"/>
+            <w:tcW w:type="dxa" w:w="2880"/>
           </w:tcPr>
           <w:p>
             <w:r/>
@@ -2039,7 +2157,7 @@
         </w:tc>
         <w:tc>
           <w:tcPr>
-            <w:tcW w:type="dxa" w:w="3024"/>
+            <w:tcW w:type="dxa" w:w="2880"/>
           </w:tcPr>
           <w:p>
             <w:r/>
@@ -2053,7 +2171,7 @@
         </w:tc>
         <w:tc>
           <w:tcPr>
-            <w:tcW w:type="dxa" w:w="3024"/>
+            <w:tcW w:type="dxa" w:w="2880"/>
           </w:tcPr>
           <w:p>
             <w:r/>
@@ -2069,8 +2187,7 @@
       <w:tr>
         <w:tc>
           <w:tcPr>
-            <w:tcW w:type="dxa" w:w="3024"/>
-            <w:shd w:fill="F2F2F2" w:val="clear"/>
+            <w:tcW w:type="dxa" w:w="2880"/>
           </w:tcPr>
           <w:p>
             <w:r/>
@@ -2084,8 +2201,7 @@
         </w:tc>
         <w:tc>
           <w:tcPr>
-            <w:tcW w:type="dxa" w:w="3024"/>
-            <w:shd w:fill="F2F2F2" w:val="clear"/>
+            <w:tcW w:type="dxa" w:w="2880"/>
           </w:tcPr>
           <w:p>
             <w:r/>
@@ -2099,8 +2215,7 @@
         </w:tc>
         <w:tc>
           <w:tcPr>
-            <w:tcW w:type="dxa" w:w="3024"/>
-            <w:shd w:fill="F2F2F2" w:val="clear"/>
+            <w:tcW w:type="dxa" w:w="2880"/>
           </w:tcPr>
           <w:p>
             <w:r/>
@@ -2117,6 +2232,14 @@
     <w:p/>
     <w:p>
       <w:pPr>
+        <w:spacing w:before="120" w:after="120"/>
+        <w:pBdr>
+          <w:bottom w:val="single" w:sz="6" w:space="1" w:color="999999"/>
+        </w:pBdr>
+      </w:pPr>
+    </w:p>
+    <w:p>
+      <w:pPr>
         <w:pStyle w:val="Heading3"/>
       </w:pPr>
       <w:r>
@@ -2185,12 +2308,13 @@
     </w:p>
     <w:p>
       <w:pPr>
-        <w:ind w:left="360"/>
+        <w:pStyle w:val="NoSpacing"/>
+        <w:shd w:fill="F2F2F2" w:val="clear"/>
       </w:pPr>
       <w:r>
         <w:rPr>
-          <w:rFonts w:ascii="Courier New" w:hAnsi="Courier New"/>
-          <w:color w:val="2D2D2D"/>
+          <w:rFonts w:ascii="Consolas" w:hAnsi="Consolas"/>
+          <w:color w:val="333333"/>
           <w:sz w:val="18"/>
         </w:rPr>
         <w:t>POST /cats/{catId}/comments</w:t>
@@ -2204,7 +2328,45 @@
         <w:t xml:space="preserve">  4. 返回评论记录</w:t>
       </w:r>
     </w:p>
-    <w:p/>
+    <w:p>
+      <w:pPr>
+        <w:jc w:val="center"/>
+      </w:pPr>
+      <w:r>
+        <w:drawing>
+          <wp:inline xmlns:a="http://schemas.openxmlformats.org/drawingml/2006/main" xmlns:pic="http://schemas.openxmlformats.org/drawingml/2006/picture">
+            <wp:extent cx="5029200" cy="5498592"/>
+            <wp:docPr id="5" name="Picture 5"/>
+            <wp:cNvGraphicFramePr>
+              <a:graphicFrameLocks noChangeAspect="1"/>
+            </wp:cNvGraphicFramePr>
+            <a:graphic>
+              <a:graphicData uri="http://schemas.openxmlformats.org/drawingml/2006/picture">
+                <pic:pic>
+                  <pic:nvPicPr>
+                    <pic:cNvPr id="0" name="tmpt9luarcf.png"/>
+                    <pic:cNvPicPr/>
+                  </pic:nvPicPr>
+                  <pic:blipFill>
+                    <a:blip r:embed="rId13"/>
+                    <a:stretch>
+                      <a:fillRect/>
+                    </a:stretch>
+                  </pic:blipFill>
+                  <pic:spPr>
+                    <a:xfrm>
+                      <a:off x="0" y="0"/>
+                      <a:ext cx="5029200" cy="5498592"/>
+                    </a:xfrm>
+                    <a:prstGeom prst="rect"/>
+                  </pic:spPr>
+                </pic:pic>
+              </a:graphicData>
+            </a:graphic>
+          </wp:inline>
+        </w:drawing>
+      </w:r>
+    </w:p>
     <w:p>
       <w:pPr>
         <w:pStyle w:val="Heading4"/>
@@ -2215,17 +2377,10 @@
     </w:p>
     <w:tbl>
       <w:tblPr>
+        <w:tblStyle w:val="TableGrid"/>
         <w:tblW w:type="auto" w:w="0"/>
         <w:jc w:val="center"/>
         <w:tblLook w:firstColumn="1" w:firstRow="1" w:lastColumn="0" w:lastRow="0" w:noHBand="0" w:noVBand="1" w:val="04A0"/>
-        <w:tblBorders>
-          <w:top w:val="single" w:sz="4" w:space="0" w:color="000000"/>
-          <w:left w:val="single" w:sz="4" w:space="0" w:color="000000"/>
-          <w:bottom w:val="single" w:sz="4" w:space="0" w:color="000000"/>
-          <w:right w:val="single" w:sz="4" w:space="0" w:color="000000"/>
-          <w:insideH w:val="single" w:sz="4" w:space="0" w:color="000000"/>
-          <w:insideV w:val="single" w:sz="4" w:space="0" w:color="000000"/>
-        </w:tblBorders>
       </w:tblPr>
       <w:tblGrid>
         <w:gridCol w:w="2880"/>
@@ -2235,7 +2390,7 @@
       <w:tr>
         <w:tc>
           <w:tcPr>
-            <w:tcW w:type="dxa" w:w="3024"/>
+            <w:tcW w:type="dxa" w:w="2880"/>
             <w:shd w:fill="D9E2F3" w:val="clear"/>
           </w:tcPr>
           <w:p>
@@ -2251,7 +2406,7 @@
         </w:tc>
         <w:tc>
           <w:tcPr>
-            <w:tcW w:type="dxa" w:w="3024"/>
+            <w:tcW w:type="dxa" w:w="2880"/>
             <w:shd w:fill="D9E2F3" w:val="clear"/>
           </w:tcPr>
           <w:p>
@@ -2267,7 +2422,7 @@
         </w:tc>
         <w:tc>
           <w:tcPr>
-            <w:tcW w:type="dxa" w:w="3024"/>
+            <w:tcW w:type="dxa" w:w="2880"/>
             <w:shd w:fill="D9E2F3" w:val="clear"/>
           </w:tcPr>
           <w:p>
@@ -2285,8 +2440,7 @@
       <w:tr>
         <w:tc>
           <w:tcPr>
-            <w:tcW w:type="dxa" w:w="3024"/>
-            <w:shd w:fill="F2F2F2" w:val="clear"/>
+            <w:tcW w:type="dxa" w:w="2880"/>
           </w:tcPr>
           <w:p>
             <w:r/>
@@ -2300,8 +2454,7 @@
         </w:tc>
         <w:tc>
           <w:tcPr>
-            <w:tcW w:type="dxa" w:w="3024"/>
-            <w:shd w:fill="F2F2F2" w:val="clear"/>
+            <w:tcW w:type="dxa" w:w="2880"/>
           </w:tcPr>
           <w:p>
             <w:r/>
@@ -2315,8 +2468,7 @@
         </w:tc>
         <w:tc>
           <w:tcPr>
-            <w:tcW w:type="dxa" w:w="3024"/>
-            <w:shd w:fill="F2F2F2" w:val="clear"/>
+            <w:tcW w:type="dxa" w:w="2880"/>
           </w:tcPr>
           <w:p>
             <w:r/>
@@ -2332,7 +2484,7 @@
       <w:tr>
         <w:tc>
           <w:tcPr>
-            <w:tcW w:type="dxa" w:w="3024"/>
+            <w:tcW w:type="dxa" w:w="2880"/>
           </w:tcPr>
           <w:p>
             <w:r/>
@@ -2346,7 +2498,7 @@
         </w:tc>
         <w:tc>
           <w:tcPr>
-            <w:tcW w:type="dxa" w:w="3024"/>
+            <w:tcW w:type="dxa" w:w="2880"/>
           </w:tcPr>
           <w:p>
             <w:r/>
@@ -2360,7 +2512,7 @@
         </w:tc>
         <w:tc>
           <w:tcPr>
-            <w:tcW w:type="dxa" w:w="3024"/>
+            <w:tcW w:type="dxa" w:w="2880"/>
           </w:tcPr>
           <w:p>
             <w:r/>
@@ -2376,8 +2528,7 @@
       <w:tr>
         <w:tc>
           <w:tcPr>
-            <w:tcW w:type="dxa" w:w="3024"/>
-            <w:shd w:fill="F2F2F2" w:val="clear"/>
+            <w:tcW w:type="dxa" w:w="2880"/>
           </w:tcPr>
           <w:p>
             <w:r/>
@@ -2391,8 +2542,7 @@
         </w:tc>
         <w:tc>
           <w:tcPr>
-            <w:tcW w:type="dxa" w:w="3024"/>
-            <w:shd w:fill="F2F2F2" w:val="clear"/>
+            <w:tcW w:type="dxa" w:w="2880"/>
           </w:tcPr>
           <w:p>
             <w:r/>
@@ -2406,8 +2556,7 @@
         </w:tc>
         <w:tc>
           <w:tcPr>
-            <w:tcW w:type="dxa" w:w="3024"/>
-            <w:shd w:fill="F2F2F2" w:val="clear"/>
+            <w:tcW w:type="dxa" w:w="2880"/>
           </w:tcPr>
           <w:p>
             <w:r/>
@@ -2422,6 +2571,14 @@
       </w:tr>
     </w:tbl>
     <w:p/>
+    <w:p>
+      <w:pPr>
+        <w:spacing w:before="120" w:after="120"/>
+        <w:pBdr>
+          <w:bottom w:val="single" w:sz="6" w:space="1" w:color="999999"/>
+        </w:pBdr>
+      </w:pPr>
+    </w:p>
     <w:p>
       <w:pPr>
         <w:pStyle w:val="Heading3"/>
@@ -2442,17 +2599,10 @@
     </w:p>
     <w:tbl>
       <w:tblPr>
+        <w:tblStyle w:val="TableGrid"/>
         <w:tblW w:type="auto" w:w="0"/>
         <w:jc w:val="center"/>
         <w:tblLook w:firstColumn="1" w:firstRow="1" w:lastColumn="0" w:lastRow="0" w:noHBand="0" w:noVBand="1" w:val="04A0"/>
-        <w:tblBorders>
-          <w:top w:val="single" w:sz="4" w:space="0" w:color="000000"/>
-          <w:left w:val="single" w:sz="4" w:space="0" w:color="000000"/>
-          <w:bottom w:val="single" w:sz="4" w:space="0" w:color="000000"/>
-          <w:right w:val="single" w:sz="4" w:space="0" w:color="000000"/>
-          <w:insideH w:val="single" w:sz="4" w:space="0" w:color="000000"/>
-          <w:insideV w:val="single" w:sz="4" w:space="0" w:color="000000"/>
-        </w:tblBorders>
       </w:tblPr>
       <w:tblGrid>
         <w:gridCol w:w="2880"/>
@@ -2462,7 +2612,7 @@
       <w:tr>
         <w:tc>
           <w:tcPr>
-            <w:tcW w:type="dxa" w:w="3024"/>
+            <w:tcW w:type="dxa" w:w="2880"/>
             <w:shd w:fill="D9E2F3" w:val="clear"/>
           </w:tcPr>
           <w:p>
@@ -2478,7 +2628,7 @@
         </w:tc>
         <w:tc>
           <w:tcPr>
-            <w:tcW w:type="dxa" w:w="3024"/>
+            <w:tcW w:type="dxa" w:w="2880"/>
             <w:shd w:fill="D9E2F3" w:val="clear"/>
           </w:tcPr>
           <w:p>
@@ -2494,7 +2644,7 @@
         </w:tc>
         <w:tc>
           <w:tcPr>
-            <w:tcW w:type="dxa" w:w="3024"/>
+            <w:tcW w:type="dxa" w:w="2880"/>
             <w:shd w:fill="D9E2F3" w:val="clear"/>
           </w:tcPr>
           <w:p>
@@ -2512,8 +2662,7 @@
       <w:tr>
         <w:tc>
           <w:tcPr>
-            <w:tcW w:type="dxa" w:w="3024"/>
-            <w:shd w:fill="F2F2F2" w:val="clear"/>
+            <w:tcW w:type="dxa" w:w="2880"/>
           </w:tcPr>
           <w:p>
             <w:r/>
@@ -2527,8 +2676,7 @@
         </w:tc>
         <w:tc>
           <w:tcPr>
-            <w:tcW w:type="dxa" w:w="3024"/>
-            <w:shd w:fill="F2F2F2" w:val="clear"/>
+            <w:tcW w:type="dxa" w:w="2880"/>
           </w:tcPr>
           <w:p>
             <w:r/>
@@ -2542,8 +2690,7 @@
         </w:tc>
         <w:tc>
           <w:tcPr>
-            <w:tcW w:type="dxa" w:w="3024"/>
-            <w:shd w:fill="F2F2F2" w:val="clear"/>
+            <w:tcW w:type="dxa" w:w="2880"/>
           </w:tcPr>
           <w:p>
             <w:r/>
@@ -2560,6 +2707,14 @@
     <w:p/>
     <w:p>
       <w:pPr>
+        <w:spacing w:before="120" w:after="120"/>
+        <w:pBdr>
+          <w:bottom w:val="single" w:sz="6" w:space="1" w:color="999999"/>
+        </w:pBdr>
+      </w:pPr>
+    </w:p>
+    <w:p>
+      <w:pPr>
         <w:pStyle w:val="Heading3"/>
       </w:pPr>
       <w:r>
@@ -2628,12 +2783,13 @@
     </w:p>
     <w:p>
       <w:pPr>
-        <w:ind w:left="360"/>
+        <w:pStyle w:val="NoSpacing"/>
+        <w:shd w:fill="F2F2F2" w:val="clear"/>
       </w:pPr>
       <w:r>
         <w:rPr>
-          <w:rFonts w:ascii="Courier New" w:hAnsi="Courier New"/>
-          <w:color w:val="2D2D2D"/>
+          <w:rFonts w:ascii="Consolas" w:hAnsi="Consolas"/>
+          <w:color w:val="333333"/>
           <w:sz w:val="18"/>
         </w:rPr>
         <w:t>POST /cats/{catId}/follow</w:t>
@@ -2656,7 +2812,45 @@
         <w:t xml:space="preserve">  3. 更新热度统计</w:t>
       </w:r>
     </w:p>
-    <w:p/>
+    <w:p>
+      <w:pPr>
+        <w:jc w:val="center"/>
+      </w:pPr>
+      <w:r>
+        <w:drawing>
+          <wp:inline xmlns:a="http://schemas.openxmlformats.org/drawingml/2006/main" xmlns:pic="http://schemas.openxmlformats.org/drawingml/2006/picture">
+            <wp:extent cx="5029200" cy="5699760"/>
+            <wp:docPr id="6" name="Picture 6"/>
+            <wp:cNvGraphicFramePr>
+              <a:graphicFrameLocks noChangeAspect="1"/>
+            </wp:cNvGraphicFramePr>
+            <a:graphic>
+              <a:graphicData uri="http://schemas.openxmlformats.org/drawingml/2006/picture">
+                <pic:pic>
+                  <pic:nvPicPr>
+                    <pic:cNvPr id="0" name="tmp1ny9qs27.png"/>
+                    <pic:cNvPicPr/>
+                  </pic:nvPicPr>
+                  <pic:blipFill>
+                    <a:blip r:embed="rId14"/>
+                    <a:stretch>
+                      <a:fillRect/>
+                    </a:stretch>
+                  </pic:blipFill>
+                  <pic:spPr>
+                    <a:xfrm>
+                      <a:off x="0" y="0"/>
+                      <a:ext cx="5029200" cy="5699760"/>
+                    </a:xfrm>
+                    <a:prstGeom prst="rect"/>
+                  </pic:spPr>
+                </pic:pic>
+              </a:graphicData>
+            </a:graphic>
+          </wp:inline>
+        </w:drawing>
+      </w:r>
+    </w:p>
     <w:p>
       <w:pPr>
         <w:pStyle w:val="Heading4"/>
@@ -2667,17 +2861,10 @@
     </w:p>
     <w:tbl>
       <w:tblPr>
+        <w:tblStyle w:val="TableGrid"/>
         <w:tblW w:type="auto" w:w="0"/>
         <w:jc w:val="center"/>
         <w:tblLook w:firstColumn="1" w:firstRow="1" w:lastColumn="0" w:lastRow="0" w:noHBand="0" w:noVBand="1" w:val="04A0"/>
-        <w:tblBorders>
-          <w:top w:val="single" w:sz="4" w:space="0" w:color="000000"/>
-          <w:left w:val="single" w:sz="4" w:space="0" w:color="000000"/>
-          <w:bottom w:val="single" w:sz="4" w:space="0" w:color="000000"/>
-          <w:right w:val="single" w:sz="4" w:space="0" w:color="000000"/>
-          <w:insideH w:val="single" w:sz="4" w:space="0" w:color="000000"/>
-          <w:insideV w:val="single" w:sz="4" w:space="0" w:color="000000"/>
-        </w:tblBorders>
       </w:tblPr>
       <w:tblGrid>
         <w:gridCol w:w="2880"/>
@@ -2687,7 +2874,7 @@
       <w:tr>
         <w:tc>
           <w:tcPr>
-            <w:tcW w:type="dxa" w:w="3024"/>
+            <w:tcW w:type="dxa" w:w="2880"/>
             <w:shd w:fill="D9E2F3" w:val="clear"/>
           </w:tcPr>
           <w:p>
@@ -2703,7 +2890,7 @@
         </w:tc>
         <w:tc>
           <w:tcPr>
-            <w:tcW w:type="dxa" w:w="3024"/>
+            <w:tcW w:type="dxa" w:w="2880"/>
             <w:shd w:fill="D9E2F3" w:val="clear"/>
           </w:tcPr>
           <w:p>
@@ -2719,7 +2906,7 @@
         </w:tc>
         <w:tc>
           <w:tcPr>
-            <w:tcW w:type="dxa" w:w="3024"/>
+            <w:tcW w:type="dxa" w:w="2880"/>
             <w:shd w:fill="D9E2F3" w:val="clear"/>
           </w:tcPr>
           <w:p>
@@ -2737,8 +2924,7 @@
       <w:tr>
         <w:tc>
           <w:tcPr>
-            <w:tcW w:type="dxa" w:w="3024"/>
-            <w:shd w:fill="F2F2F2" w:val="clear"/>
+            <w:tcW w:type="dxa" w:w="2880"/>
           </w:tcPr>
           <w:p>
             <w:r/>
@@ -2752,8 +2938,7 @@
         </w:tc>
         <w:tc>
           <w:tcPr>
-            <w:tcW w:type="dxa" w:w="3024"/>
-            <w:shd w:fill="F2F2F2" w:val="clear"/>
+            <w:tcW w:type="dxa" w:w="2880"/>
           </w:tcPr>
           <w:p>
             <w:r/>
@@ -2767,8 +2952,7 @@
         </w:tc>
         <w:tc>
           <w:tcPr>
-            <w:tcW w:type="dxa" w:w="3024"/>
-            <w:shd w:fill="F2F2F2" w:val="clear"/>
+            <w:tcW w:type="dxa" w:w="2880"/>
           </w:tcPr>
           <w:p>
             <w:r/>
@@ -2784,7 +2968,7 @@
       <w:tr>
         <w:tc>
           <w:tcPr>
-            <w:tcW w:type="dxa" w:w="3024"/>
+            <w:tcW w:type="dxa" w:w="2880"/>
           </w:tcPr>
           <w:p>
             <w:r/>
@@ -2798,7 +2982,7 @@
         </w:tc>
         <w:tc>
           <w:tcPr>
-            <w:tcW w:type="dxa" w:w="3024"/>
+            <w:tcW w:type="dxa" w:w="2880"/>
           </w:tcPr>
           <w:p>
             <w:r/>
@@ -2812,7 +2996,7 @@
         </w:tc>
         <w:tc>
           <w:tcPr>
-            <w:tcW w:type="dxa" w:w="3024"/>
+            <w:tcW w:type="dxa" w:w="2880"/>
           </w:tcPr>
           <w:p>
             <w:r/>
@@ -2828,8 +3012,7 @@
       <w:tr>
         <w:tc>
           <w:tcPr>
-            <w:tcW w:type="dxa" w:w="3024"/>
-            <w:shd w:fill="F2F2F2" w:val="clear"/>
+            <w:tcW w:type="dxa" w:w="2880"/>
           </w:tcPr>
           <w:p>
             <w:r/>
@@ -2843,8 +3026,7 @@
         </w:tc>
         <w:tc>
           <w:tcPr>
-            <w:tcW w:type="dxa" w:w="3024"/>
-            <w:shd w:fill="F2F2F2" w:val="clear"/>
+            <w:tcW w:type="dxa" w:w="2880"/>
           </w:tcPr>
           <w:p>
             <w:r/>
@@ -2858,8 +3040,7 @@
         </w:tc>
         <w:tc>
           <w:tcPr>
-            <w:tcW w:type="dxa" w:w="3024"/>
-            <w:shd w:fill="F2F2F2" w:val="clear"/>
+            <w:tcW w:type="dxa" w:w="2880"/>
           </w:tcPr>
           <w:p>
             <w:r/>
@@ -2875,7 +3056,7 @@
       <w:tr>
         <w:tc>
           <w:tcPr>
-            <w:tcW w:type="dxa" w:w="3024"/>
+            <w:tcW w:type="dxa" w:w="2880"/>
           </w:tcPr>
           <w:p>
             <w:r/>
@@ -2889,7 +3070,7 @@
         </w:tc>
         <w:tc>
           <w:tcPr>
-            <w:tcW w:type="dxa" w:w="3024"/>
+            <w:tcW w:type="dxa" w:w="2880"/>
           </w:tcPr>
           <w:p>
             <w:r/>
@@ -2903,7 +3084,7 @@
         </w:tc>
         <w:tc>
           <w:tcPr>
-            <w:tcW w:type="dxa" w:w="3024"/>
+            <w:tcW w:type="dxa" w:w="2880"/>
           </w:tcPr>
           <w:p>
             <w:r/>
@@ -2920,6 +3101,14 @@
     <w:p/>
     <w:p>
       <w:pPr>
+        <w:spacing w:before="120" w:after="120"/>
+        <w:pBdr>
+          <w:bottom w:val="single" w:sz="6" w:space="1" w:color="999999"/>
+        </w:pBdr>
+      </w:pPr>
+    </w:p>
+    <w:p>
+      <w:pPr>
         <w:pStyle w:val="Heading3"/>
       </w:pPr>
       <w:r>
@@ -2988,12 +3177,13 @@
     </w:p>
     <w:p>
       <w:pPr>
-        <w:ind w:left="360"/>
+        <w:pStyle w:val="NoSpacing"/>
+        <w:shd w:fill="F2F2F2" w:val="clear"/>
       </w:pPr>
       <w:r>
         <w:rPr>
-          <w:rFonts w:ascii="Courier New" w:hAnsi="Courier New"/>
-          <w:color w:val="2D2D2D"/>
+          <w:rFonts w:ascii="Consolas" w:hAnsi="Consolas"/>
+          <w:color w:val="333333"/>
           <w:sz w:val="18"/>
         </w:rPr>
         <w:t>POST /cats/{catId}/rating</w:t>
@@ -3011,7 +3201,45 @@
         <w:t xml:space="preserve">  4. 重新计算猫咪平均分 avgRating</w:t>
       </w:r>
     </w:p>
-    <w:p/>
+    <w:p>
+      <w:pPr>
+        <w:jc w:val="center"/>
+      </w:pPr>
+      <w:r>
+        <w:drawing>
+          <wp:inline xmlns:a="http://schemas.openxmlformats.org/drawingml/2006/main" xmlns:pic="http://schemas.openxmlformats.org/drawingml/2006/picture">
+            <wp:extent cx="5029200" cy="5448300"/>
+            <wp:docPr id="7" name="Picture 7"/>
+            <wp:cNvGraphicFramePr>
+              <a:graphicFrameLocks noChangeAspect="1"/>
+            </wp:cNvGraphicFramePr>
+            <a:graphic>
+              <a:graphicData uri="http://schemas.openxmlformats.org/drawingml/2006/picture">
+                <pic:pic>
+                  <pic:nvPicPr>
+                    <pic:cNvPr id="0" name="tmpw01ewj79.png"/>
+                    <pic:cNvPicPr/>
+                  </pic:nvPicPr>
+                  <pic:blipFill>
+                    <a:blip r:embed="rId15"/>
+                    <a:stretch>
+                      <a:fillRect/>
+                    </a:stretch>
+                  </pic:blipFill>
+                  <pic:spPr>
+                    <a:xfrm>
+                      <a:off x="0" y="0"/>
+                      <a:ext cx="5029200" cy="5448300"/>
+                    </a:xfrm>
+                    <a:prstGeom prst="rect"/>
+                  </pic:spPr>
+                </pic:pic>
+              </a:graphicData>
+            </a:graphic>
+          </wp:inline>
+        </w:drawing>
+      </w:r>
+    </w:p>
     <w:p>
       <w:pPr>
         <w:pStyle w:val="Heading4"/>
@@ -3022,17 +3250,10 @@
     </w:p>
     <w:tbl>
       <w:tblPr>
+        <w:tblStyle w:val="TableGrid"/>
         <w:tblW w:type="auto" w:w="0"/>
         <w:jc w:val="center"/>
         <w:tblLook w:firstColumn="1" w:firstRow="1" w:lastColumn="0" w:lastRow="0" w:noHBand="0" w:noVBand="1" w:val="04A0"/>
-        <w:tblBorders>
-          <w:top w:val="single" w:sz="4" w:space="0" w:color="000000"/>
-          <w:left w:val="single" w:sz="4" w:space="0" w:color="000000"/>
-          <w:bottom w:val="single" w:sz="4" w:space="0" w:color="000000"/>
-          <w:right w:val="single" w:sz="4" w:space="0" w:color="000000"/>
-          <w:insideH w:val="single" w:sz="4" w:space="0" w:color="000000"/>
-          <w:insideV w:val="single" w:sz="4" w:space="0" w:color="000000"/>
-        </w:tblBorders>
       </w:tblPr>
       <w:tblGrid>
         <w:gridCol w:w="2880"/>
@@ -3042,7 +3263,7 @@
       <w:tr>
         <w:tc>
           <w:tcPr>
-            <w:tcW w:type="dxa" w:w="3024"/>
+            <w:tcW w:type="dxa" w:w="2880"/>
             <w:shd w:fill="D9E2F3" w:val="clear"/>
           </w:tcPr>
           <w:p>
@@ -3058,7 +3279,7 @@
         </w:tc>
         <w:tc>
           <w:tcPr>
-            <w:tcW w:type="dxa" w:w="3024"/>
+            <w:tcW w:type="dxa" w:w="2880"/>
             <w:shd w:fill="D9E2F3" w:val="clear"/>
           </w:tcPr>
           <w:p>
@@ -3074,7 +3295,7 @@
         </w:tc>
         <w:tc>
           <w:tcPr>
-            <w:tcW w:type="dxa" w:w="3024"/>
+            <w:tcW w:type="dxa" w:w="2880"/>
             <w:shd w:fill="D9E2F3" w:val="clear"/>
           </w:tcPr>
           <w:p>
@@ -3092,8 +3313,7 @@
       <w:tr>
         <w:tc>
           <w:tcPr>
-            <w:tcW w:type="dxa" w:w="3024"/>
-            <w:shd w:fill="F2F2F2" w:val="clear"/>
+            <w:tcW w:type="dxa" w:w="2880"/>
           </w:tcPr>
           <w:p>
             <w:r/>
@@ -3107,8 +3327,7 @@
         </w:tc>
         <w:tc>
           <w:tcPr>
-            <w:tcW w:type="dxa" w:w="3024"/>
-            <w:shd w:fill="F2F2F2" w:val="clear"/>
+            <w:tcW w:type="dxa" w:w="2880"/>
           </w:tcPr>
           <w:p>
             <w:r/>
@@ -3122,8 +3341,7 @@
         </w:tc>
         <w:tc>
           <w:tcPr>
-            <w:tcW w:type="dxa" w:w="3024"/>
-            <w:shd w:fill="F2F2F2" w:val="clear"/>
+            <w:tcW w:type="dxa" w:w="2880"/>
           </w:tcPr>
           <w:p>
             <w:r/>
@@ -3139,7 +3357,7 @@
       <w:tr>
         <w:tc>
           <w:tcPr>
-            <w:tcW w:type="dxa" w:w="3024"/>
+            <w:tcW w:type="dxa" w:w="2880"/>
           </w:tcPr>
           <w:p>
             <w:r/>
@@ -3153,7 +3371,7 @@
         </w:tc>
         <w:tc>
           <w:tcPr>
-            <w:tcW w:type="dxa" w:w="3024"/>
+            <w:tcW w:type="dxa" w:w="2880"/>
           </w:tcPr>
           <w:p>
             <w:r/>
@@ -3167,7 +3385,7 @@
         </w:tc>
         <w:tc>
           <w:tcPr>
-            <w:tcW w:type="dxa" w:w="3024"/>
+            <w:tcW w:type="dxa" w:w="2880"/>
           </w:tcPr>
           <w:p>
             <w:r/>
@@ -3183,8 +3401,7 @@
       <w:tr>
         <w:tc>
           <w:tcPr>
-            <w:tcW w:type="dxa" w:w="3024"/>
-            <w:shd w:fill="F2F2F2" w:val="clear"/>
+            <w:tcW w:type="dxa" w:w="2880"/>
           </w:tcPr>
           <w:p>
             <w:r/>
@@ -3198,8 +3415,7 @@
         </w:tc>
         <w:tc>
           <w:tcPr>
-            <w:tcW w:type="dxa" w:w="3024"/>
-            <w:shd w:fill="F2F2F2" w:val="clear"/>
+            <w:tcW w:type="dxa" w:w="2880"/>
           </w:tcPr>
           <w:p>
             <w:r/>
@@ -3213,8 +3429,7 @@
         </w:tc>
         <w:tc>
           <w:tcPr>
-            <w:tcW w:type="dxa" w:w="3024"/>
-            <w:shd w:fill="F2F2F2" w:val="clear"/>
+            <w:tcW w:type="dxa" w:w="2880"/>
           </w:tcPr>
           <w:p>
             <w:r/>
@@ -3231,6 +3446,14 @@
     <w:p/>
     <w:p>
       <w:pPr>
+        <w:spacing w:before="120" w:after="120"/>
+        <w:pBdr>
+          <w:bottom w:val="single" w:sz="6" w:space="1" w:color="999999"/>
+        </w:pBdr>
+      </w:pPr>
+    </w:p>
+    <w:p>
+      <w:pPr>
         <w:pStyle w:val="Heading3"/>
       </w:pPr>
       <w:r>
@@ -3299,12 +3522,13 @@
     </w:p>
     <w:p>
       <w:pPr>
-        <w:ind w:left="360"/>
+        <w:pStyle w:val="NoSpacing"/>
+        <w:shd w:fill="F2F2F2" w:val="clear"/>
       </w:pPr>
       <w:r>
         <w:rPr>
-          <w:rFonts w:ascii="Courier New" w:hAnsi="Courier New"/>
-          <w:color w:val="2D2D2D"/>
+          <w:rFonts w:ascii="Consolas" w:hAnsi="Consolas"/>
+          <w:color w:val="333333"/>
           <w:sz w:val="18"/>
         </w:rPr>
         <w:t>记录行为（各模块调用）</w:t>
@@ -3331,7 +3555,53 @@
         <w:t xml:space="preserve">  5. 缓存热度数据供推荐算法使用</w:t>
       </w:r>
     </w:p>
-    <w:p/>
+    <w:p>
+      <w:pPr>
+        <w:jc w:val="center"/>
+      </w:pPr>
+      <w:r>
+        <w:drawing>
+          <wp:inline xmlns:a="http://schemas.openxmlformats.org/drawingml/2006/main" xmlns:pic="http://schemas.openxmlformats.org/drawingml/2006/picture">
+            <wp:extent cx="5029200" cy="5238750"/>
+            <wp:docPr id="8" name="Picture 8"/>
+            <wp:cNvGraphicFramePr>
+              <a:graphicFrameLocks noChangeAspect="1"/>
+            </wp:cNvGraphicFramePr>
+            <a:graphic>
+              <a:graphicData uri="http://schemas.openxmlformats.org/drawingml/2006/picture">
+                <pic:pic>
+                  <pic:nvPicPr>
+                    <pic:cNvPr id="0" name="tmpa03sm2zh.png"/>
+                    <pic:cNvPicPr/>
+                  </pic:nvPicPr>
+                  <pic:blipFill>
+                    <a:blip r:embed="rId16"/>
+                    <a:stretch>
+                      <a:fillRect/>
+                    </a:stretch>
+                  </pic:blipFill>
+                  <pic:spPr>
+                    <a:xfrm>
+                      <a:off x="0" y="0"/>
+                      <a:ext cx="5029200" cy="5238750"/>
+                    </a:xfrm>
+                    <a:prstGeom prst="rect"/>
+                  </pic:spPr>
+                </pic:pic>
+              </a:graphicData>
+            </a:graphic>
+          </wp:inline>
+        </w:drawing>
+      </w:r>
+    </w:p>
+    <w:p>
+      <w:pPr>
+        <w:spacing w:before="120" w:after="120"/>
+        <w:pBdr>
+          <w:bottom w:val="single" w:sz="6" w:space="1" w:color="999999"/>
+        </w:pBdr>
+      </w:pPr>
+    </w:p>
     <w:p>
       <w:pPr>
         <w:pStyle w:val="Heading3"/>
@@ -3364,8 +3634,6 @@
     <w:p>
       <w:pPr>
         <w:pStyle w:val="ListBullet"/>
-        <w:spacing w:after="40" w:before="20"/>
-        <w:ind w:left="360"/>
       </w:pPr>
       <w:r>
         <w:t>猫咪数量 ≤ 100 时，单次计算 ≤ 1s</w:t>
@@ -3374,8 +3642,6 @@
     <w:p>
       <w:pPr>
         <w:pStyle w:val="ListBullet"/>
-        <w:spacing w:after="40" w:before="20"/>
-        <w:ind w:left="360"/>
       </w:pPr>
       <w:r>
         <w:t>特征向量预缓存，避免重复计算</w:t>
@@ -3384,8 +3650,6 @@
     <w:p>
       <w:pPr>
         <w:pStyle w:val="ListBullet"/>
-        <w:spacing w:after="40" w:before="20"/>
-        <w:ind w:left="360"/>
       </w:pPr>
       <w:r>
         <w:t>热度因子每 15 分钟批量刷新</w:t>
@@ -3402,8 +3666,6 @@
     <w:p>
       <w:pPr>
         <w:pStyle w:val="ListBullet"/>
-        <w:spacing w:after="40" w:before="20"/>
-        <w:ind w:left="360"/>
       </w:pPr>
       <w:r>
         <w:t>当前猫咪 ID</w:t>
@@ -3412,8 +3674,6 @@
     <w:p>
       <w:pPr>
         <w:pStyle w:val="ListBullet"/>
-        <w:spacing w:after="40" w:before="20"/>
-        <w:ind w:left="360"/>
       </w:pPr>
       <w:r>
         <w:t>特征来源：cat 表的 colour_tags、personality_tags、location_area、gender</w:t>
@@ -3422,8 +3682,6 @@
     <w:p>
       <w:pPr>
         <w:pStyle w:val="ListBullet"/>
-        <w:spacing w:after="40" w:before="20"/>
-        <w:ind w:left="360"/>
       </w:pPr>
       <w:r>
         <w:t>热度来源：photo_like 表（点赞数）、cat_follow 表（关注数）、cat_rating 表（评分均分）</w:t>
@@ -3452,12 +3710,13 @@
     </w:p>
     <w:p>
       <w:pPr>
-        <w:ind w:left="360"/>
+        <w:pStyle w:val="NoSpacing"/>
+        <w:shd w:fill="F2F2F2" w:val="clear"/>
       </w:pPr>
       <w:r>
         <w:rPr>
-          <w:rFonts w:ascii="Courier New" w:hAnsi="Courier New"/>
-          <w:color w:val="2D2D2D"/>
+          <w:rFonts w:ascii="Consolas" w:hAnsi="Consolas"/>
+          <w:color w:val="333333"/>
           <w:sz w:val="18"/>
         </w:rPr>
         <w:t>算法：CatSimilarityAlgorithm</w:t>
@@ -3473,6 +3732,7 @@
         <w:br/>
         <w:t xml:space="preserve">  allCats = SELECT * FROM cat WHERE id != targetCatId AND status = 'ACTIVE'</w:t>
         <w:br/>
+        <w:t xml:space="preserve">  </w:t>
         <w:br/>
         <w:t xml:space="preserve">  提取 targetCat 特征：</w:t>
         <w:br/>
@@ -3493,7 +3753,7 @@
         <w:br/>
         <w:t xml:space="preserve">  globalLocations = 所有猫咪 location_area 的并集</w:t>
         <w:br/>
-        <w:t xml:space="preserve">  totalDimensions = len(globalColours) + len(globalPersonalities)</w:t>
+        <w:t xml:space="preserve">  totalDimensions = len(globalColours) + len(globalPersonalities) </w:t>
         <w:br/>
         <w:t xml:space="preserve">                    + len(globalLocations) + 3  // 3 = 性别维度数</w:t>
         <w:br/>
@@ -3576,7 +3836,7 @@
         <w:br/>
         <w:t xml:space="preserve">  heatData = QUERY:</w:t>
         <w:br/>
-        <w:t xml:space="preserve">      SELECT</w:t>
+        <w:t xml:space="preserve">      SELECT </w:t>
         <w:br/>
         <w:t xml:space="preserve">          cat_id,</w:t>
         <w:br/>
@@ -3624,11 +3884,11 @@
         <w:br/>
         <w:t xml:space="preserve">  FOR catId IN allCats:</w:t>
         <w:br/>
-        <w:t xml:space="preserve">      finalScores[catId] = α * similarityScores[catId]</w:t>
+        <w:t xml:space="preserve">      finalScores[catId] = α * similarityScores[catId] </w:t>
         <w:br/>
         <w:t xml:space="preserve">                         + β1 * likeNorm[catId]</w:t>
         <w:br/>
-        <w:t xml:space="preserve">                         + β2 * followNorm[catId]</w:t>
+        <w:t xml:space="preserve">                         + β2 * followNorm[catId] </w:t>
         <w:br/>
         <w:t xml:space="preserve">                         + β3 * ratingNorm[catId]</w:t>
         <w:br/>
@@ -3640,7 +3900,45 @@
         <w:t xml:space="preserve">  RETURN sortedCats[0:N]  // 返回 Top-5</w:t>
       </w:r>
     </w:p>
-    <w:p/>
+    <w:p>
+      <w:pPr>
+        <w:jc w:val="center"/>
+      </w:pPr>
+      <w:r>
+        <w:drawing>
+          <wp:inline xmlns:a="http://schemas.openxmlformats.org/drawingml/2006/main" xmlns:pic="http://schemas.openxmlformats.org/drawingml/2006/picture">
+            <wp:extent cx="5029200" cy="6537960"/>
+            <wp:docPr id="9" name="Picture 9"/>
+            <wp:cNvGraphicFramePr>
+              <a:graphicFrameLocks noChangeAspect="1"/>
+            </wp:cNvGraphicFramePr>
+            <a:graphic>
+              <a:graphicData uri="http://schemas.openxmlformats.org/drawingml/2006/picture">
+                <pic:pic>
+                  <pic:nvPicPr>
+                    <pic:cNvPr id="0" name="tmp9zcehvj4.png"/>
+                    <pic:cNvPicPr/>
+                  </pic:nvPicPr>
+                  <pic:blipFill>
+                    <a:blip r:embed="rId17"/>
+                    <a:stretch>
+                      <a:fillRect/>
+                    </a:stretch>
+                  </pic:blipFill>
+                  <pic:spPr>
+                    <a:xfrm>
+                      <a:off x="0" y="0"/>
+                      <a:ext cx="5029200" cy="6537960"/>
+                    </a:xfrm>
+                    <a:prstGeom prst="rect"/>
+                  </pic:spPr>
+                </pic:pic>
+              </a:graphicData>
+            </a:graphic>
+          </wp:inline>
+        </w:drawing>
+      </w:r>
+    </w:p>
     <w:p>
       <w:pPr>
         <w:pStyle w:val="Heading4"/>
@@ -3651,18 +3949,20 @@
     </w:p>
     <w:p>
       <w:pPr>
-        <w:ind w:left="360"/>
+        <w:pStyle w:val="NoSpacing"/>
+        <w:shd w:fill="F2F2F2" w:val="clear"/>
       </w:pPr>
       <w:r>
         <w:rPr>
-          <w:rFonts w:ascii="Courier New" w:hAnsi="Courier New"/>
-          <w:color w:val="2D2D2D"/>
+          <w:rFonts w:ascii="Consolas" w:hAnsi="Consolas"/>
+          <w:color w:val="333333"/>
           <w:sz w:val="18"/>
         </w:rPr>
         <w:t>@Service</w:t>
         <w:br/>
         <w:t>public class CatSimilarityAlgorithm {</w:t>
         <w:br/>
+        <w:t xml:space="preserve">    </w:t>
         <w:br/>
         <w:t xml:space="preserve">    @Autowired private CatRepository catRepository;</w:t>
         <w:br/>
@@ -3672,6 +3972,7 @@
         <w:br/>
         <w:t xml:space="preserve">    @Autowired private CatRatingRepository catRatingRepository;</w:t>
         <w:br/>
+        <w:t xml:space="preserve">    </w:t>
         <w:br/>
         <w:t xml:space="preserve">    public List&lt;RecommendResult&gt; recommend(Long targetCatId, int topN) {</w:t>
         <w:br/>
@@ -3681,16 +3982,19 @@
         <w:br/>
         <w:t xml:space="preserve">        List&lt;Cat&gt; allCats = catRepository.findByStatus("ACTIVE");</w:t>
         <w:br/>
+        <w:t xml:space="preserve">        </w:t>
         <w:br/>
         <w:t xml:space="preserve">        // 2. 构建特征词典</w:t>
         <w:br/>
         <w:t xml:space="preserve">        FeatureDictionary dict = buildDictionary(allCats);</w:t>
         <w:br/>
+        <w:t xml:space="preserve">        </w:t>
         <w:br/>
         <w:t xml:space="preserve">        // 3. 向量化目标猫咪</w:t>
         <w:br/>
         <w:t xml:space="preserve">        double[] targetVector = encode(target, dict);</w:t>
         <w:br/>
+        <w:t xml:space="preserve">        </w:t>
         <w:br/>
         <w:t xml:space="preserve">        // 4. 计算相似度</w:t>
         <w:br/>
@@ -3706,11 +4010,13 @@
         <w:br/>
         <w:t xml:space="preserve">        }</w:t>
         <w:br/>
+        <w:t xml:space="preserve">        </w:t>
         <w:br/>
         <w:t xml:space="preserve">        // 5. 融合热度因子</w:t>
         <w:br/>
         <w:t xml:space="preserve">        Map&lt;Long, Double&gt; finalScores = fuseHeatFactors(simScores, allCats);</w:t>
         <w:br/>
+        <w:t xml:space="preserve">        </w:t>
         <w:br/>
         <w:t xml:space="preserve">        // 6. 排序取 Top-N</w:t>
         <w:br/>
@@ -3729,7 +4035,6 @@
         <w:t>}</w:t>
       </w:r>
     </w:p>
-    <w:p/>
     <w:p>
       <w:pPr>
         <w:pStyle w:val="Heading4"/>
@@ -3740,17 +4045,10 @@
     </w:p>
     <w:tbl>
       <w:tblPr>
+        <w:tblStyle w:val="TableGrid"/>
         <w:tblW w:type="auto" w:w="0"/>
         <w:jc w:val="center"/>
         <w:tblLook w:firstColumn="1" w:firstRow="1" w:lastColumn="0" w:lastRow="0" w:noHBand="0" w:noVBand="1" w:val="04A0"/>
-        <w:tblBorders>
-          <w:top w:val="single" w:sz="4" w:space="0" w:color="000000"/>
-          <w:left w:val="single" w:sz="4" w:space="0" w:color="000000"/>
-          <w:bottom w:val="single" w:sz="4" w:space="0" w:color="000000"/>
-          <w:right w:val="single" w:sz="4" w:space="0" w:color="000000"/>
-          <w:insideH w:val="single" w:sz="4" w:space="0" w:color="000000"/>
-          <w:insideV w:val="single" w:sz="4" w:space="0" w:color="000000"/>
-        </w:tblBorders>
       </w:tblPr>
       <w:tblGrid>
         <w:gridCol w:w="2160"/>
@@ -3761,7 +4059,7 @@
       <w:tr>
         <w:tc>
           <w:tcPr>
-            <w:tcW w:type="dxa" w:w="2268"/>
+            <w:tcW w:type="dxa" w:w="2160"/>
             <w:shd w:fill="D9E2F3" w:val="clear"/>
           </w:tcPr>
           <w:p>
@@ -3777,7 +4075,7 @@
         </w:tc>
         <w:tc>
           <w:tcPr>
-            <w:tcW w:type="dxa" w:w="2268"/>
+            <w:tcW w:type="dxa" w:w="2160"/>
             <w:shd w:fill="D9E2F3" w:val="clear"/>
           </w:tcPr>
           <w:p>
@@ -3793,7 +4091,7 @@
         </w:tc>
         <w:tc>
           <w:tcPr>
-            <w:tcW w:type="dxa" w:w="2268"/>
+            <w:tcW w:type="dxa" w:w="2160"/>
             <w:shd w:fill="D9E2F3" w:val="clear"/>
           </w:tcPr>
           <w:p>
@@ -3809,7 +4107,7 @@
         </w:tc>
         <w:tc>
           <w:tcPr>
-            <w:tcW w:type="dxa" w:w="2268"/>
+            <w:tcW w:type="dxa" w:w="2160"/>
             <w:shd w:fill="D9E2F3" w:val="clear"/>
           </w:tcPr>
           <w:p>
@@ -3827,8 +4125,7 @@
       <w:tr>
         <w:tc>
           <w:tcPr>
-            <w:tcW w:type="dxa" w:w="2268"/>
-            <w:shd w:fill="F2F2F2" w:val="clear"/>
+            <w:tcW w:type="dxa" w:w="2160"/>
           </w:tcPr>
           <w:p>
             <w:r/>
@@ -3842,8 +4139,7 @@
         </w:tc>
         <w:tc>
           <w:tcPr>
-            <w:tcW w:type="dxa" w:w="2268"/>
-            <w:shd w:fill="F2F2F2" w:val="clear"/>
+            <w:tcW w:type="dxa" w:w="2160"/>
           </w:tcPr>
           <w:p>
             <w:r/>
@@ -3857,8 +4153,7 @@
         </w:tc>
         <w:tc>
           <w:tcPr>
-            <w:tcW w:type="dxa" w:w="2268"/>
-            <w:shd w:fill="F2F2F2" w:val="clear"/>
+            <w:tcW w:type="dxa" w:w="2160"/>
           </w:tcPr>
           <w:p>
             <w:r/>
@@ -3872,8 +4167,7 @@
         </w:tc>
         <w:tc>
           <w:tcPr>
-            <w:tcW w:type="dxa" w:w="2268"/>
-            <w:shd w:fill="F2F2F2" w:val="clear"/>
+            <w:tcW w:type="dxa" w:w="2160"/>
           </w:tcPr>
           <w:p>
             <w:r/>
@@ -3900,12 +4194,13 @@
     </w:p>
     <w:p>
       <w:pPr>
-        <w:ind w:left="360"/>
+        <w:pStyle w:val="NoSpacing"/>
+        <w:shd w:fill="F2F2F2" w:val="clear"/>
       </w:pPr>
       <w:r>
         <w:rPr>
-          <w:rFonts w:ascii="Courier New" w:hAnsi="Courier New"/>
-          <w:color w:val="2D2D2D"/>
+          <w:rFonts w:ascii="Consolas" w:hAnsi="Consolas"/>
+          <w:color w:val="333333"/>
           <w:sz w:val="18"/>
         </w:rPr>
         <w:t>{</w:t>
@@ -3931,7 +4226,6 @@
         <w:t>}</w:t>
       </w:r>
     </w:p>
-    <w:p/>
     <w:p>
       <w:pPr>
         <w:pStyle w:val="Heading4"/>
@@ -3943,8 +4237,6 @@
     <w:p>
       <w:pPr>
         <w:pStyle w:val="ListBullet"/>
-        <w:spacing w:after="40" w:before="20"/>
-        <w:ind w:left="360"/>
       </w:pPr>
       <w:r>
         <w:t>算法仅适用于活跃猫咪（status = ACTIVE）</w:t>
@@ -3953,8 +4245,6 @@
     <w:p>
       <w:pPr>
         <w:pStyle w:val="ListBullet"/>
-        <w:spacing w:after="40" w:before="20"/>
-        <w:ind w:left="360"/>
       </w:pPr>
       <w:r>
         <w:t>特征维度随猫咪数量增加，需控制词典大小</w:t>
@@ -3963,8 +4253,6 @@
     <w:p>
       <w:pPr>
         <w:pStyle w:val="ListBullet"/>
-        <w:spacing w:after="40" w:before="20"/>
-        <w:ind w:left="360"/>
       </w:pPr>
       <w:r>
         <w:t>热度因子缓存每 15 分钟刷新，非实时数据</w:t>
@@ -3981,8 +4269,6 @@
     <w:p>
       <w:pPr>
         <w:pStyle w:val="ListBullet"/>
-        <w:spacing w:after="40" w:before="20"/>
-        <w:ind w:left="360"/>
       </w:pPr>
       <w:r>
         <w:t>相同特征猫咪应获得高相似度分数</w:t>
@@ -3991,8 +4277,6 @@
     <w:p>
       <w:pPr>
         <w:pStyle w:val="ListBullet"/>
-        <w:spacing w:after="40" w:before="20"/>
-        <w:ind w:left="360"/>
       </w:pPr>
       <w:r>
         <w:t>多热度因子加权后排序应合理</w:t>
@@ -4001,8 +4285,6 @@
     <w:p>
       <w:pPr>
         <w:pStyle w:val="ListBullet"/>
-        <w:spacing w:after="40" w:before="20"/>
-        <w:ind w:left="360"/>
       </w:pPr>
       <w:r>
         <w:t>边界情况：仅有一只猫时返回空列表</w:t>
@@ -4011,12 +4293,18 @@
     <w:p>
       <w:pPr>
         <w:pStyle w:val="ListBullet"/>
-        <w:spacing w:after="40" w:before="20"/>
-        <w:ind w:left="360"/>
       </w:pPr>
       <w:r>
         <w:t>性能测试：50+ 猫咪时计算时间 ≤ 1s</w:t>
       </w:r>
+    </w:p>
+    <w:p>
+      <w:pPr>
+        <w:spacing w:before="120" w:after="120"/>
+        <w:pBdr>
+          <w:bottom w:val="single" w:sz="6" w:space="1" w:color="999999"/>
+        </w:pBdr>
+      </w:pPr>
     </w:p>
     <w:p>
       <w:pPr>
@@ -4051,78 +4339,90 @@
     <w:p>
       <w:pPr>
         <w:pStyle w:val="ListBullet"/>
-        <w:spacing w:after="40" w:before="20"/>
-        <w:ind w:left="360"/>
-      </w:pPr>
+      </w:pPr>
+      <w:r/>
       <w:r>
         <w:rPr>
           <w:b/>
         </w:rPr>
+        <w:t>底色：</w:t>
+      </w:r>
+      <w:r>
         <w:t xml:space="preserve"> 深黑 `#050505`，营造沉浸感</w:t>
       </w:r>
     </w:p>
     <w:p>
       <w:pPr>
         <w:pStyle w:val="ListBullet"/>
-        <w:spacing w:after="40" w:before="20"/>
-        <w:ind w:left="360"/>
-      </w:pPr>
+      </w:pPr>
+      <w:r/>
       <w:r>
         <w:rPr>
           <w:b/>
         </w:rPr>
+        <w:t>点缀色：</w:t>
+      </w:r>
+      <w:r>
         <w:t xml:space="preserve"> 琥珀金 `#f59e0b`，温暖且与猫咪主题契合</w:t>
       </w:r>
     </w:p>
     <w:p>
       <w:pPr>
         <w:pStyle w:val="ListBullet"/>
-        <w:spacing w:after="40" w:before="20"/>
-        <w:ind w:left="360"/>
-      </w:pPr>
+      </w:pPr>
+      <w:r/>
       <w:r>
         <w:rPr>
           <w:b/>
         </w:rPr>
+        <w:t>字体：</w:t>
+      </w:r>
+      <w:r>
         <w:t xml:space="preserve"> Plus Jakarta Sans（标题）+ Inter（正文）</w:t>
       </w:r>
     </w:p>
     <w:p>
       <w:pPr>
         <w:pStyle w:val="ListBullet"/>
-        <w:spacing w:after="40" w:before="20"/>
-        <w:ind w:left="360"/>
-      </w:pPr>
+      </w:pPr>
+      <w:r/>
       <w:r>
         <w:rPr>
           <w:b/>
         </w:rPr>
+        <w:t>卡片：</w:t>
+      </w:r>
+      <w:r>
         <w:t xml:space="preserve"> 双层嵌套（Double-Bezel）+ 玻璃拟态（backdrop-blur）</w:t>
       </w:r>
     </w:p>
     <w:p>
       <w:pPr>
         <w:pStyle w:val="ListBullet"/>
-        <w:spacing w:after="40" w:before="20"/>
-        <w:ind w:left="360"/>
-      </w:pPr>
+      </w:pPr>
+      <w:r/>
       <w:r>
         <w:rPr>
           <w:b/>
         </w:rPr>
+        <w:t>动效：</w:t>
+      </w:r>
+      <w:r>
         <w:t xml:space="preserve"> 自定义 cubic-bezier 弹性曲线，滚动渐入动画</w:t>
       </w:r>
     </w:p>
     <w:p>
       <w:pPr>
         <w:pStyle w:val="ListBullet"/>
-        <w:spacing w:after="40" w:before="20"/>
-        <w:ind w:left="360"/>
-      </w:pPr>
+      </w:pPr>
+      <w:r/>
       <w:r>
         <w:rPr>
           <w:b/>
         </w:rPr>
+        <w:t>布局：</w:t>
+      </w:r>
+      <w:r>
         <w:t xml:space="preserve"> Bento 错落网格 + 大留白</w:t>
       </w:r>
     </w:p>
@@ -4136,17 +4436,10 @@
     </w:p>
     <w:tbl>
       <w:tblPr>
+        <w:tblStyle w:val="TableGrid"/>
         <w:tblW w:type="auto" w:w="0"/>
         <w:jc w:val="center"/>
         <w:tblLook w:firstColumn="1" w:firstRow="1" w:lastColumn="0" w:lastRow="0" w:noHBand="0" w:noVBand="1" w:val="04A0"/>
-        <w:tblBorders>
-          <w:top w:val="single" w:sz="4" w:space="0" w:color="000000"/>
-          <w:left w:val="single" w:sz="4" w:space="0" w:color="000000"/>
-          <w:bottom w:val="single" w:sz="4" w:space="0" w:color="000000"/>
-          <w:right w:val="single" w:sz="4" w:space="0" w:color="000000"/>
-          <w:insideH w:val="single" w:sz="4" w:space="0" w:color="000000"/>
-          <w:insideV w:val="single" w:sz="4" w:space="0" w:color="000000"/>
-        </w:tblBorders>
       </w:tblPr>
       <w:tblGrid>
         <w:gridCol w:w="2880"/>
@@ -4156,7 +4449,7 @@
       <w:tr>
         <w:tc>
           <w:tcPr>
-            <w:tcW w:type="dxa" w:w="3024"/>
+            <w:tcW w:type="dxa" w:w="2880"/>
             <w:shd w:fill="D9E2F3" w:val="clear"/>
           </w:tcPr>
           <w:p>
@@ -4172,7 +4465,7 @@
         </w:tc>
         <w:tc>
           <w:tcPr>
-            <w:tcW w:type="dxa" w:w="3024"/>
+            <w:tcW w:type="dxa" w:w="2880"/>
             <w:shd w:fill="D9E2F3" w:val="clear"/>
           </w:tcPr>
           <w:p>
@@ -4188,7 +4481,7 @@
         </w:tc>
         <w:tc>
           <w:tcPr>
-            <w:tcW w:type="dxa" w:w="3024"/>
+            <w:tcW w:type="dxa" w:w="2880"/>
             <w:shd w:fill="D9E2F3" w:val="clear"/>
           </w:tcPr>
           <w:p>
@@ -4206,8 +4499,7 @@
       <w:tr>
         <w:tc>
           <w:tcPr>
-            <w:tcW w:type="dxa" w:w="3024"/>
-            <w:shd w:fill="F2F2F2" w:val="clear"/>
+            <w:tcW w:type="dxa" w:w="2880"/>
           </w:tcPr>
           <w:p>
             <w:r/>
@@ -4221,8 +4513,7 @@
         </w:tc>
         <w:tc>
           <w:tcPr>
-            <w:tcW w:type="dxa" w:w="3024"/>
-            <w:shd w:fill="F2F2F2" w:val="clear"/>
+            <w:tcW w:type="dxa" w:w="2880"/>
           </w:tcPr>
           <w:p>
             <w:r/>
@@ -4236,8 +4527,7 @@
         </w:tc>
         <w:tc>
           <w:tcPr>
-            <w:tcW w:type="dxa" w:w="3024"/>
-            <w:shd w:fill="F2F2F2" w:val="clear"/>
+            <w:tcW w:type="dxa" w:w="2880"/>
           </w:tcPr>
           <w:p>
             <w:r/>
@@ -4253,7 +4543,7 @@
       <w:tr>
         <w:tc>
           <w:tcPr>
-            <w:tcW w:type="dxa" w:w="3024"/>
+            <w:tcW w:type="dxa" w:w="2880"/>
           </w:tcPr>
           <w:p>
             <w:r/>
@@ -4267,7 +4557,7 @@
         </w:tc>
         <w:tc>
           <w:tcPr>
-            <w:tcW w:type="dxa" w:w="3024"/>
+            <w:tcW w:type="dxa" w:w="2880"/>
           </w:tcPr>
           <w:p>
             <w:r/>
@@ -4281,7 +4571,7 @@
         </w:tc>
         <w:tc>
           <w:tcPr>
-            <w:tcW w:type="dxa" w:w="3024"/>
+            <w:tcW w:type="dxa" w:w="2880"/>
           </w:tcPr>
           <w:p>
             <w:r/>
@@ -4297,8 +4587,7 @@
       <w:tr>
         <w:tc>
           <w:tcPr>
-            <w:tcW w:type="dxa" w:w="3024"/>
-            <w:shd w:fill="F2F2F2" w:val="clear"/>
+            <w:tcW w:type="dxa" w:w="2880"/>
           </w:tcPr>
           <w:p>
             <w:r/>
@@ -4312,8 +4601,7 @@
         </w:tc>
         <w:tc>
           <w:tcPr>
-            <w:tcW w:type="dxa" w:w="3024"/>
-            <w:shd w:fill="F2F2F2" w:val="clear"/>
+            <w:tcW w:type="dxa" w:w="2880"/>
           </w:tcPr>
           <w:p>
             <w:r/>
@@ -4327,8 +4615,7 @@
         </w:tc>
         <w:tc>
           <w:tcPr>
-            <w:tcW w:type="dxa" w:w="3024"/>
-            <w:shd w:fill="F2F2F2" w:val="clear"/>
+            <w:tcW w:type="dxa" w:w="2880"/>
           </w:tcPr>
           <w:p>
             <w:r/>
@@ -4344,7 +4631,7 @@
       <w:tr>
         <w:tc>
           <w:tcPr>
-            <w:tcW w:type="dxa" w:w="3024"/>
+            <w:tcW w:type="dxa" w:w="2880"/>
           </w:tcPr>
           <w:p>
             <w:r/>
@@ -4358,7 +4645,7 @@
         </w:tc>
         <w:tc>
           <w:tcPr>
-            <w:tcW w:type="dxa" w:w="3024"/>
+            <w:tcW w:type="dxa" w:w="2880"/>
           </w:tcPr>
           <w:p>
             <w:r/>
@@ -4372,7 +4659,7 @@
         </w:tc>
         <w:tc>
           <w:tcPr>
-            <w:tcW w:type="dxa" w:w="3024"/>
+            <w:tcW w:type="dxa" w:w="2880"/>
           </w:tcPr>
           <w:p>
             <w:r/>
@@ -4407,14 +4694,123 @@
     </w:p>
     <w:p>
       <w:pPr>
-        <w:ind w:left="360"/>
+        <w:pStyle w:val="NoSpacing"/>
+        <w:shd w:fill="F2F2F2" w:val="clear"/>
+      </w:pPr>
+      <w:r>
+        <w:rPr>
+          <w:rFonts w:ascii="Consolas" w:hAnsi="Consolas"/>
+          <w:color w:val="333333"/>
+          <w:sz w:val="18"/>
+        </w:rPr>
+        <w:t>┌─────────────────────────────────────────────┐</w:t>
+        <w:br/>
+        <w:t>│  [浮动玻璃导航栏]  🐱 南信猫友记  猫咪 搜索 关于 │</w:t>
+        <w:br/>
+        <w:t>├─────────────────────────────────────────────┤</w:t>
+        <w:br/>
+        <w:t>│                                             │</w:t>
+        <w:br/>
+        <w:t>│    校园里的猫邻居                              │</w:t>
+        <w:br/>
+        <w:t>│    记录每一只在南信大生活过的猫咪               │</w:t>
+        <w:br/>
+        <w:t>│                                             │</w:t>
+        <w:br/>
+        <w:t>│  [🐱在校] [🏠待领养] [🔍失踪] [🌈喵星]         │</w:t>
+        <w:br/>
+        <w:t>│  12 只猫咪                                    │</w:t>
+        <w:br/>
+        <w:t>│                                             │</w:t>
+        <w:br/>
+        <w:t>│  ┌─────────┐  ┌──────┐  ┌─────────┐         │</w:t>
+        <w:br/>
+        <w:t>│  │  橘座    │  │ 小黑 │  │  花卷   │         │</w:t>
+        <w:br/>
+        <w:t>│  │  🟢在校  │  │ 🟢在校│  │  🟢在校 │         │</w:t>
+        <w:br/>
+        <w:t>│  │  中苑·♂  │  │ 西苑·♀│  │  东苑·♂ │         │</w:t>
+        <w:br/>
+        <w:t>│  └─────────┘  └──────┘  └─────────┘         │</w:t>
+        <w:br/>
+        <w:t>│  ┌──────┐  ┌─────────┐  ┌──────┐            │</w:t>
+        <w:br/>
+        <w:t>│  │ 雪球  │  │  大橘   │  │ 阿福  │            │</w:t>
+        <w:br/>
+        <w:t>│  │ 🟢在校│  │  🟢在校 │  │ 🟢在校│            │</w:t>
+        <w:br/>
+        <w:t>│  └──────┘  └─────────┘  └──────┘            │</w:t>
+        <w:br/>
+        <w:t>│                                             │</w:t>
+        <w:br/>
+        <w:t>│            [ 加载更多 ]                       │</w:t>
+        <w:br/>
+        <w:t>├─────────────────────────────────────────────┤</w:t>
+        <w:br/>
+        <w:t>│  南信猫友记 © 2025                           │</w:t>
+        <w:br/>
+        <w:t>└─────────────────────────────────────────────┘</w:t>
+      </w:r>
+    </w:p>
+    <w:p>
+      <w:r/>
+      <w:r>
+        <w:rPr>
+          <w:b/>
+        </w:rPr>
+        <w:t>说明：</w:t>
+      </w:r>
+      <w:r/>
+    </w:p>
+    <w:p>
+      <w:pPr>
+        <w:pStyle w:val="ListBullet"/>
+      </w:pPr>
+      <w:r>
+        <w:t>顶部 Hero 区展示项目标题和简介</w:t>
+      </w:r>
+    </w:p>
+    <w:p>
+      <w:pPr>
+        <w:pStyle w:val="ListBullet"/>
+      </w:pPr>
+      <w:r>
+        <w:t>状态 Tab 栏采用药丸形按钮，支持横向滚动</w:t>
+      </w:r>
+    </w:p>
+    <w:p>
+      <w:pPr>
+        <w:pStyle w:val="ListBullet"/>
+      </w:pPr>
+      <w:r>
+        <w:t>猫咪卡片采用 4 列 Bento Grid，卡片尺寸交替变化（2×2、2×1、1×1、1×2）</w:t>
+      </w:r>
+    </w:p>
+    <w:p>
+      <w:pPr>
+        <w:pStyle w:val="ListBullet"/>
+      </w:pPr>
+      <w:r>
+        <w:t>每张卡片包含渐变色背景占位、猫咪名、状态标签、位置和性别信息</w:t>
+      </w:r>
+    </w:p>
+    <w:p>
+      <w:pPr>
+        <w:pStyle w:val="ListBullet"/>
+      </w:pPr>
+      <w:r>
+        <w:t>移动端降级为单列布局</w:t>
+      </w:r>
+    </w:p>
+    <w:p>
+      <w:pPr>
         <w:jc w:val="center"/>
       </w:pPr>
       <w:r>
         <w:drawing>
           <wp:inline xmlns:a="http://schemas.openxmlformats.org/drawingml/2006/main" xmlns:pic="http://schemas.openxmlformats.org/drawingml/2006/picture">
             <wp:extent cx="5029200" cy="2769618"/>
-            <wp:docPr id="1" name="Picture 1"/>
+            <wp:docPr id="10" name="Picture 10"/>
             <wp:cNvGraphicFramePr>
               <a:graphicFrameLocks noChangeAspect="1"/>
             </wp:cNvGraphicFramePr>
@@ -4426,7 +4822,7 @@
                     <pic:cNvPicPr/>
                   </pic:nvPicPr>
                   <pic:blipFill>
-                    <a:blip r:embed="rId9"/>
+                    <a:blip r:embed="rId18"/>
                     <a:stretch>
                       <a:fillRect/>
                     </a:stretch>
@@ -4447,78 +4843,6 @@
     </w:p>
     <w:p>
       <w:pPr>
-        <w:jc w:val="center"/>
-      </w:pPr>
-      <w:r>
-        <w:rPr>
-          <w:i/>
-          <w:sz w:val="18"/>
-        </w:rPr>
-        <w:t>图：主页 实际界面</w:t>
-      </w:r>
-    </w:p>
-    <w:p>
-      <w:r/>
-      <w:r>
-        <w:rPr>
-          <w:b/>
-        </w:rPr>
-        <w:t>说明：</w:t>
-      </w:r>
-      <w:r/>
-    </w:p>
-    <w:p>
-      <w:pPr>
-        <w:pStyle w:val="ListBullet"/>
-        <w:spacing w:after="40" w:before="20"/>
-        <w:ind w:left="360"/>
-      </w:pPr>
-      <w:r>
-        <w:t>顶部 Hero 区展示项目标题和简介</w:t>
-      </w:r>
-    </w:p>
-    <w:p>
-      <w:pPr>
-        <w:pStyle w:val="ListBullet"/>
-        <w:spacing w:after="40" w:before="20"/>
-        <w:ind w:left="360"/>
-      </w:pPr>
-      <w:r>
-        <w:t>状态 Tab 栏采用药丸形按钮，支持横向滚动</w:t>
-      </w:r>
-    </w:p>
-    <w:p>
-      <w:pPr>
-        <w:pStyle w:val="ListBullet"/>
-        <w:spacing w:after="40" w:before="20"/>
-        <w:ind w:left="360"/>
-      </w:pPr>
-      <w:r>
-        <w:t>猫咪卡片采用 4 列 Bento Grid，卡片尺寸交替变化（2×2、2×1、1×1、1×2）</w:t>
-      </w:r>
-    </w:p>
-    <w:p>
-      <w:pPr>
-        <w:pStyle w:val="ListBullet"/>
-        <w:spacing w:after="40" w:before="20"/>
-        <w:ind w:left="360"/>
-      </w:pPr>
-      <w:r>
-        <w:t>每张卡片包含渐变色背景占位、猫咪名、状态标签、位置和性别信息</w:t>
-      </w:r>
-    </w:p>
-    <w:p>
-      <w:pPr>
-        <w:pStyle w:val="ListBullet"/>
-        <w:spacing w:after="40" w:before="20"/>
-        <w:ind w:left="360"/>
-      </w:pPr>
-      <w:r>
-        <w:t>移动端降级为单列布局</w:t>
-      </w:r>
-    </w:p>
-    <w:p>
-      <w:pPr>
         <w:pStyle w:val="Heading3"/>
       </w:pPr>
       <w:r>
@@ -4537,14 +4861,127 @@
     </w:p>
     <w:p>
       <w:pPr>
-        <w:ind w:left="360"/>
+        <w:pStyle w:val="NoSpacing"/>
+        <w:shd w:fill="F2F2F2" w:val="clear"/>
+      </w:pPr>
+      <w:r>
+        <w:rPr>
+          <w:rFonts w:ascii="Consolas" w:hAnsi="Consolas"/>
+          <w:color w:val="333333"/>
+          <w:sz w:val="18"/>
+        </w:rPr>
+        <w:t>┌──────────────────────────────────────┬──────────┐</w:t>
+        <w:br/>
+        <w:t>│  [照片轮播 ← ● ● ● →]               │ 相似猫咪  │</w:t>
+        <w:br/>
+        <w:t>│                                      │  ─────── │</w:t>
+        <w:br/>
+        <w:t>│        🐱  "晒太阳的橘座"              │  大橘     │</w:t>
+        <w:br/>
+        <w:t>│                                      │  花卷     │</w:t>
+        <w:br/>
+        <w:t>│                                      │  雪球     │</w:t>
+        <w:br/>
+        <w:t>├──────────────────────────────────────┴──────────┤</w:t>
+        <w:br/>
+        <w:t>│  橘座  胖橘  🟢在校                              │</w:t>
+        <w:br/>
+        <w:t>│  42  28  4.5                                     │</w:t>
+        <w:br/>
+        <w:t>│  点赞  关注 评分                                   │</w:t>
+        <w:br/>
+        <w:t>│                                                  │</w:t>
+        <w:br/>
+        <w:t>│  性别: 男孩  │ 出生: 2020  │ 体重: 6.5kg          │</w:t>
+        <w:br/>
+        <w:t>│  毛色: 橘色  │ 绝育: 已绝育│ 位置: 中苑            │</w:t>
+        <w:br/>
+        <w:t>│                                                  │</w:t>
+        <w:br/>
+        <w:t>│  性格                                            │</w:t>
+        <w:br/>
+        <w:t>│  [亲人] [可抱] [贪吃]                               │</w:t>
+        <w:br/>
+        <w:t>│  非常亲人的大橘猫...                                │</w:t>
+        <w:br/>
+        <w:t>│                                                  │</w:t>
+        <w:br/>
+        <w:t>│  [关注]    ★★★★☆                                 │</w:t>
+        <w:br/>
+        <w:t>│                                                  │</w:t>
+        <w:br/>
+        <w:t>│  留言                                            │</w:t>
+        <w:br/>
+        <w:t>│  [________________________] [发送]                │</w:t>
+        <w:br/>
+        <w:t>│  猫奴一号 · 2025-06-15                            │</w:t>
+        <w:br/>
+        <w:t>│  今天在中苑看到它了！                              │</w:t>
+        <w:br/>
+        <w:t>│                                                  │</w:t>
+        <w:br/>
+        <w:t>└──────────────────────────────────────────────────┘</w:t>
+      </w:r>
+    </w:p>
+    <w:p>
+      <w:r/>
+      <w:r>
+        <w:rPr>
+          <w:b/>
+        </w:rPr>
+        <w:t>说明：</w:t>
+      </w:r>
+      <w:r/>
+    </w:p>
+    <w:p>
+      <w:pPr>
+        <w:pStyle w:val="ListBullet"/>
+      </w:pPr>
+      <w:r>
+        <w:t>照片轮播占据页面顶部约 65vh，支持左右箭头切换和底部圆点指示</w:t>
+      </w:r>
+    </w:p>
+    <w:p>
+      <w:pPr>
+        <w:pStyle w:val="ListBullet"/>
+      </w:pPr>
+      <w:r>
+        <w:t>台式机右侧固定侧栏展示相似猫咪推荐（调用 P6 算法）</w:t>
+      </w:r>
+    </w:p>
+    <w:p>
+      <w:pPr>
+        <w:pStyle w:val="ListBullet"/>
+      </w:pPr>
+      <w:r>
+        <w:t>猫咪信息区包含统计数字、属性表格、性格标签、互动按钮</w:t>
+      </w:r>
+    </w:p>
+    <w:p>
+      <w:pPr>
+        <w:pStyle w:val="ListBullet"/>
+      </w:pPr>
+      <w:r>
+        <w:t>留言区支持即时输入和发送，评论按时间倒序排列</w:t>
+      </w:r>
+    </w:p>
+    <w:p>
+      <w:pPr>
+        <w:pStyle w:val="ListBullet"/>
+      </w:pPr>
+      <w:r>
+        <w:t>移动端 1024px 以下右侧推荐栏并入主内容流</w:t>
+      </w:r>
+    </w:p>
+    <w:p>
+      <w:pPr>
         <w:jc w:val="center"/>
       </w:pPr>
       <w:r>
         <w:drawing>
           <wp:inline xmlns:a="http://schemas.openxmlformats.org/drawingml/2006/main" xmlns:pic="http://schemas.openxmlformats.org/drawingml/2006/picture">
             <wp:extent cx="5029200" cy="3487119"/>
-            <wp:docPr id="2" name="Picture 2"/>
+            <wp:docPr id="11" name="Picture 11"/>
             <wp:cNvGraphicFramePr>
               <a:graphicFrameLocks noChangeAspect="1"/>
             </wp:cNvGraphicFramePr>
@@ -4556,7 +4993,7 @@
                     <pic:cNvPicPr/>
                   </pic:nvPicPr>
                   <pic:blipFill>
-                    <a:blip r:embed="rId10"/>
+                    <a:blip r:embed="rId19"/>
                     <a:stretch>
                       <a:fillRect/>
                     </a:stretch>
@@ -4577,78 +5014,6 @@
     </w:p>
     <w:p>
       <w:pPr>
-        <w:jc w:val="center"/>
-      </w:pPr>
-      <w:r>
-        <w:rPr>
-          <w:i/>
-          <w:sz w:val="18"/>
-        </w:rPr>
-        <w:t>图：猫咪详情 实际界面</w:t>
-      </w:r>
-    </w:p>
-    <w:p>
-      <w:r/>
-      <w:r>
-        <w:rPr>
-          <w:b/>
-        </w:rPr>
-        <w:t>说明：</w:t>
-      </w:r>
-      <w:r/>
-    </w:p>
-    <w:p>
-      <w:pPr>
-        <w:pStyle w:val="ListBullet"/>
-        <w:spacing w:after="40" w:before="20"/>
-        <w:ind w:left="360"/>
-      </w:pPr>
-      <w:r>
-        <w:t>照片轮播占据页面顶部约 65vh，支持左右箭头切换和底部圆点指示</w:t>
-      </w:r>
-    </w:p>
-    <w:p>
-      <w:pPr>
-        <w:pStyle w:val="ListBullet"/>
-        <w:spacing w:after="40" w:before="20"/>
-        <w:ind w:left="360"/>
-      </w:pPr>
-      <w:r>
-        <w:t>台式机右侧固定侧栏展示相似猫咪推荐（调用 P6 算法）</w:t>
-      </w:r>
-    </w:p>
-    <w:p>
-      <w:pPr>
-        <w:pStyle w:val="ListBullet"/>
-        <w:spacing w:after="40" w:before="20"/>
-        <w:ind w:left="360"/>
-      </w:pPr>
-      <w:r>
-        <w:t>猫咪信息区包含统计数字、属性表格、性格标签、互动按钮</w:t>
-      </w:r>
-    </w:p>
-    <w:p>
-      <w:pPr>
-        <w:pStyle w:val="ListBullet"/>
-        <w:spacing w:after="40" w:before="20"/>
-        <w:ind w:left="360"/>
-      </w:pPr>
-      <w:r>
-        <w:t>留言区支持即时输入和发送，评论按时间倒序排列</w:t>
-      </w:r>
-    </w:p>
-    <w:p>
-      <w:pPr>
-        <w:pStyle w:val="ListBullet"/>
-        <w:spacing w:after="40" w:before="20"/>
-        <w:ind w:left="360"/>
-      </w:pPr>
-      <w:r>
-        <w:t>移动端 1024px 以下右侧推荐栏并入主内容流</w:t>
-      </w:r>
-    </w:p>
-    <w:p>
-      <w:pPr>
         <w:pStyle w:val="Heading3"/>
       </w:pPr>
       <w:r>
@@ -4668,8 +5033,6 @@
     <w:p>
       <w:pPr>
         <w:pStyle w:val="ListBullet"/>
-        <w:spacing w:after="40" w:before="20"/>
-        <w:ind w:left="360"/>
       </w:pPr>
       <w:r>
         <w:t>位置：固定顶部居中，`border-radius: 999px` 药丸形状</w:t>
@@ -4678,8 +5041,6 @@
     <w:p>
       <w:pPr>
         <w:pStyle w:val="ListBullet"/>
-        <w:spacing w:after="40" w:before="20"/>
-        <w:ind w:left="360"/>
       </w:pPr>
       <w:r>
         <w:t>样式：`backdrop-filter: blur(24px)` 玻璃效果</w:t>
@@ -4688,8 +5049,6 @@
     <w:p>
       <w:pPr>
         <w:pStyle w:val="ListBullet"/>
-        <w:spacing w:after="40" w:before="20"/>
-        <w:ind w:left="360"/>
       </w:pPr>
       <w:r>
         <w:t>品牌：左侧 🐱 南信猫友记</w:t>
@@ -4698,8 +5057,6 @@
     <w:p>
       <w:pPr>
         <w:pStyle w:val="ListBullet"/>
-        <w:spacing w:after="40" w:before="20"/>
-        <w:ind w:left="360"/>
       </w:pPr>
       <w:r>
         <w:t>链接：猫咪、搜索、关于（桌面端直接显示，移动端折叠为汉堡菜单）</w:t>
@@ -4708,8 +5065,6 @@
     <w:p>
       <w:pPr>
         <w:pStyle w:val="ListBullet"/>
-        <w:spacing w:after="40" w:before="20"/>
-        <w:ind w:left="360"/>
       </w:pPr>
       <w:r>
         <w:t>汉堡菜单展开为全屏遮罩 + 大号文字链接</w:t>
@@ -4718,8 +5073,6 @@
     <w:p>
       <w:pPr>
         <w:pStyle w:val="ListBullet"/>
-        <w:spacing w:after="40" w:before="20"/>
-        <w:ind w:left="360"/>
       </w:pPr>
       <w:r>
         <w:t>导航高度：桌面 ≤ 64px，移动端自适应</w:t>
@@ -4735,17 +5088,10 @@
     </w:p>
     <w:tbl>
       <w:tblPr>
+        <w:tblStyle w:val="TableGrid"/>
         <w:tblW w:type="auto" w:w="0"/>
         <w:jc w:val="center"/>
         <w:tblLook w:firstColumn="1" w:firstRow="1" w:lastColumn="0" w:lastRow="0" w:noHBand="0" w:noVBand="1" w:val="04A0"/>
-        <w:tblBorders>
-          <w:top w:val="single" w:sz="4" w:space="0" w:color="000000"/>
-          <w:left w:val="single" w:sz="4" w:space="0" w:color="000000"/>
-          <w:bottom w:val="single" w:sz="4" w:space="0" w:color="000000"/>
-          <w:right w:val="single" w:sz="4" w:space="0" w:color="000000"/>
-          <w:insideH w:val="single" w:sz="4" w:space="0" w:color="000000"/>
-          <w:insideV w:val="single" w:sz="4" w:space="0" w:color="000000"/>
-        </w:tblBorders>
       </w:tblPr>
       <w:tblGrid>
         <w:gridCol w:w="2880"/>
@@ -4755,7 +5101,7 @@
       <w:tr>
         <w:tc>
           <w:tcPr>
-            <w:tcW w:type="dxa" w:w="3024"/>
+            <w:tcW w:type="dxa" w:w="2880"/>
             <w:shd w:fill="D9E2F3" w:val="clear"/>
           </w:tcPr>
           <w:p>
@@ -4771,7 +5117,7 @@
         </w:tc>
         <w:tc>
           <w:tcPr>
-            <w:tcW w:type="dxa" w:w="3024"/>
+            <w:tcW w:type="dxa" w:w="2880"/>
             <w:shd w:fill="D9E2F3" w:val="clear"/>
           </w:tcPr>
           <w:p>
@@ -4787,7 +5133,7 @@
         </w:tc>
         <w:tc>
           <w:tcPr>
-            <w:tcW w:type="dxa" w:w="3024"/>
+            <w:tcW w:type="dxa" w:w="2880"/>
             <w:shd w:fill="D9E2F3" w:val="clear"/>
           </w:tcPr>
           <w:p>
@@ -4805,8 +5151,7 @@
       <w:tr>
         <w:tc>
           <w:tcPr>
-            <w:tcW w:type="dxa" w:w="3024"/>
-            <w:shd w:fill="F2F2F2" w:val="clear"/>
+            <w:tcW w:type="dxa" w:w="2880"/>
           </w:tcPr>
           <w:p>
             <w:r/>
@@ -4820,8 +5165,7 @@
         </w:tc>
         <w:tc>
           <w:tcPr>
-            <w:tcW w:type="dxa" w:w="3024"/>
-            <w:shd w:fill="F2F2F2" w:val="clear"/>
+            <w:tcW w:type="dxa" w:w="2880"/>
           </w:tcPr>
           <w:p>
             <w:r/>
@@ -4835,8 +5179,7 @@
         </w:tc>
         <w:tc>
           <w:tcPr>
-            <w:tcW w:type="dxa" w:w="3024"/>
-            <w:shd w:fill="F2F2F2" w:val="clear"/>
+            <w:tcW w:type="dxa" w:w="2880"/>
           </w:tcPr>
           <w:p>
             <w:r/>
@@ -4852,7 +5195,7 @@
       <w:tr>
         <w:tc>
           <w:tcPr>
-            <w:tcW w:type="dxa" w:w="3024"/>
+            <w:tcW w:type="dxa" w:w="2880"/>
           </w:tcPr>
           <w:p>
             <w:r/>
@@ -4866,7 +5209,7 @@
         </w:tc>
         <w:tc>
           <w:tcPr>
-            <w:tcW w:type="dxa" w:w="3024"/>
+            <w:tcW w:type="dxa" w:w="2880"/>
           </w:tcPr>
           <w:p>
             <w:r/>
@@ -4880,7 +5223,7 @@
         </w:tc>
         <w:tc>
           <w:tcPr>
-            <w:tcW w:type="dxa" w:w="3024"/>
+            <w:tcW w:type="dxa" w:w="2880"/>
           </w:tcPr>
           <w:p>
             <w:r/>
@@ -4896,8 +5239,7 @@
       <w:tr>
         <w:tc>
           <w:tcPr>
-            <w:tcW w:type="dxa" w:w="3024"/>
-            <w:shd w:fill="F2F2F2" w:val="clear"/>
+            <w:tcW w:type="dxa" w:w="2880"/>
           </w:tcPr>
           <w:p>
             <w:r/>
@@ -4911,8 +5253,7 @@
         </w:tc>
         <w:tc>
           <w:tcPr>
-            <w:tcW w:type="dxa" w:w="3024"/>
-            <w:shd w:fill="F2F2F2" w:val="clear"/>
+            <w:tcW w:type="dxa" w:w="2880"/>
           </w:tcPr>
           <w:p>
             <w:r/>
@@ -4926,8 +5267,7 @@
         </w:tc>
         <w:tc>
           <w:tcPr>
-            <w:tcW w:type="dxa" w:w="3024"/>
-            <w:shd w:fill="F2F2F2" w:val="clear"/>
+            <w:tcW w:type="dxa" w:w="2880"/>
           </w:tcPr>
           <w:p>
             <w:r/>
@@ -4943,7 +5283,7 @@
       <w:tr>
         <w:tc>
           <w:tcPr>
-            <w:tcW w:type="dxa" w:w="3024"/>
+            <w:tcW w:type="dxa" w:w="2880"/>
           </w:tcPr>
           <w:p>
             <w:r/>
@@ -4957,7 +5297,7 @@
         </w:tc>
         <w:tc>
           <w:tcPr>
-            <w:tcW w:type="dxa" w:w="3024"/>
+            <w:tcW w:type="dxa" w:w="2880"/>
           </w:tcPr>
           <w:p>
             <w:r/>
@@ -4971,7 +5311,7 @@
         </w:tc>
         <w:tc>
           <w:tcPr>
-            <w:tcW w:type="dxa" w:w="3024"/>
+            <w:tcW w:type="dxa" w:w="2880"/>
           </w:tcPr>
           <w:p>
             <w:r/>
@@ -4987,8 +5327,7 @@
       <w:tr>
         <w:tc>
           <w:tcPr>
-            <w:tcW w:type="dxa" w:w="3024"/>
-            <w:shd w:fill="F2F2F2" w:val="clear"/>
+            <w:tcW w:type="dxa" w:w="2880"/>
           </w:tcPr>
           <w:p>
             <w:r/>
@@ -5002,8 +5341,7 @@
         </w:tc>
         <w:tc>
           <w:tcPr>
-            <w:tcW w:type="dxa" w:w="3024"/>
-            <w:shd w:fill="F2F2F2" w:val="clear"/>
+            <w:tcW w:type="dxa" w:w="2880"/>
           </w:tcPr>
           <w:p>
             <w:r/>
@@ -5017,8 +5355,7 @@
         </w:tc>
         <w:tc>
           <w:tcPr>
-            <w:tcW w:type="dxa" w:w="3024"/>
-            <w:shd w:fill="F2F2F2" w:val="clear"/>
+            <w:tcW w:type="dxa" w:w="2880"/>
           </w:tcPr>
           <w:p>
             <w:r/>
@@ -5034,7 +5371,7 @@
       <w:tr>
         <w:tc>
           <w:tcPr>
-            <w:tcW w:type="dxa" w:w="3024"/>
+            <w:tcW w:type="dxa" w:w="2880"/>
           </w:tcPr>
           <w:p>
             <w:r/>
@@ -5048,7 +5385,7 @@
         </w:tc>
         <w:tc>
           <w:tcPr>
-            <w:tcW w:type="dxa" w:w="3024"/>
+            <w:tcW w:type="dxa" w:w="2880"/>
           </w:tcPr>
           <w:p>
             <w:r/>
@@ -5062,7 +5399,7 @@
         </w:tc>
         <w:tc>
           <w:tcPr>
-            <w:tcW w:type="dxa" w:w="3024"/>
+            <w:tcW w:type="dxa" w:w="2880"/>
           </w:tcPr>
           <w:p>
             <w:r/>
@@ -5078,8 +5415,7 @@
       <w:tr>
         <w:tc>
           <w:tcPr>
-            <w:tcW w:type="dxa" w:w="3024"/>
-            <w:shd w:fill="F2F2F2" w:val="clear"/>
+            <w:tcW w:type="dxa" w:w="2880"/>
           </w:tcPr>
           <w:p>
             <w:r/>
@@ -5093,8 +5429,7 @@
         </w:tc>
         <w:tc>
           <w:tcPr>
-            <w:tcW w:type="dxa" w:w="3024"/>
-            <w:shd w:fill="F2F2F2" w:val="clear"/>
+            <w:tcW w:type="dxa" w:w="2880"/>
           </w:tcPr>
           <w:p>
             <w:r/>
@@ -5108,8 +5443,7 @@
         </w:tc>
         <w:tc>
           <w:tcPr>
-            <w:tcW w:type="dxa" w:w="3024"/>
-            <w:shd w:fill="F2F2F2" w:val="clear"/>
+            <w:tcW w:type="dxa" w:w="2880"/>
           </w:tcPr>
           <w:p>
             <w:r/>
@@ -5125,7 +5459,7 @@
       <w:tr>
         <w:tc>
           <w:tcPr>
-            <w:tcW w:type="dxa" w:w="3024"/>
+            <w:tcW w:type="dxa" w:w="2880"/>
           </w:tcPr>
           <w:p>
             <w:r/>
@@ -5139,7 +5473,7 @@
         </w:tc>
         <w:tc>
           <w:tcPr>
-            <w:tcW w:type="dxa" w:w="3024"/>
+            <w:tcW w:type="dxa" w:w="2880"/>
           </w:tcPr>
           <w:p>
             <w:r/>
@@ -5153,7 +5487,7 @@
         </w:tc>
         <w:tc>
           <w:tcPr>
-            <w:tcW w:type="dxa" w:w="3024"/>
+            <w:tcW w:type="dxa" w:w="2880"/>
           </w:tcPr>
           <w:p>
             <w:r/>
@@ -5169,8 +5503,7 @@
       <w:tr>
         <w:tc>
           <w:tcPr>
-            <w:tcW w:type="dxa" w:w="3024"/>
-            <w:shd w:fill="F2F2F2" w:val="clear"/>
+            <w:tcW w:type="dxa" w:w="2880"/>
           </w:tcPr>
           <w:p>
             <w:r/>
@@ -5184,8 +5517,7 @@
         </w:tc>
         <w:tc>
           <w:tcPr>
-            <w:tcW w:type="dxa" w:w="3024"/>
-            <w:shd w:fill="F2F2F2" w:val="clear"/>
+            <w:tcW w:type="dxa" w:w="2880"/>
           </w:tcPr>
           <w:p>
             <w:r/>
@@ -5199,8 +5531,7 @@
         </w:tc>
         <w:tc>
           <w:tcPr>
-            <w:tcW w:type="dxa" w:w="3024"/>
-            <w:shd w:fill="F2F2F2" w:val="clear"/>
+            <w:tcW w:type="dxa" w:w="2880"/>
           </w:tcPr>
           <w:p>
             <w:r/>
@@ -5216,7 +5547,7 @@
       <w:tr>
         <w:tc>
           <w:tcPr>
-            <w:tcW w:type="dxa" w:w="3024"/>
+            <w:tcW w:type="dxa" w:w="2880"/>
           </w:tcPr>
           <w:p>
             <w:r/>
@@ -5230,7 +5561,7 @@
         </w:tc>
         <w:tc>
           <w:tcPr>
-            <w:tcW w:type="dxa" w:w="3024"/>
+            <w:tcW w:type="dxa" w:w="2880"/>
           </w:tcPr>
           <w:p>
             <w:r/>
@@ -5244,7 +5575,7 @@
         </w:tc>
         <w:tc>
           <w:tcPr>
-            <w:tcW w:type="dxa" w:w="3024"/>
+            <w:tcW w:type="dxa" w:w="2880"/>
           </w:tcPr>
           <w:p>
             <w:r/>
@@ -5260,8 +5591,7 @@
       <w:tr>
         <w:tc>
           <w:tcPr>
-            <w:tcW w:type="dxa" w:w="3024"/>
-            <w:shd w:fill="F2F2F2" w:val="clear"/>
+            <w:tcW w:type="dxa" w:w="2880"/>
           </w:tcPr>
           <w:p>
             <w:r/>
@@ -5275,8 +5605,7 @@
         </w:tc>
         <w:tc>
           <w:tcPr>
-            <w:tcW w:type="dxa" w:w="3024"/>
-            <w:shd w:fill="F2F2F2" w:val="clear"/>
+            <w:tcW w:type="dxa" w:w="2880"/>
           </w:tcPr>
           <w:p>
             <w:r/>
@@ -5290,8 +5619,7 @@
         </w:tc>
         <w:tc>
           <w:tcPr>
-            <w:tcW w:type="dxa" w:w="3024"/>
-            <w:shd w:fill="F2F2F2" w:val="clear"/>
+            <w:tcW w:type="dxa" w:w="2880"/>
           </w:tcPr>
           <w:p>
             <w:r/>
@@ -5316,17 +5644,10 @@
     </w:p>
     <w:tbl>
       <w:tblPr>
+        <w:tblStyle w:val="TableGrid"/>
         <w:tblW w:type="auto" w:w="0"/>
         <w:jc w:val="center"/>
         <w:tblLook w:firstColumn="1" w:firstRow="1" w:lastColumn="0" w:lastRow="0" w:noHBand="0" w:noVBand="1" w:val="04A0"/>
-        <w:tblBorders>
-          <w:top w:val="single" w:sz="4" w:space="0" w:color="000000"/>
-          <w:left w:val="single" w:sz="4" w:space="0" w:color="000000"/>
-          <w:bottom w:val="single" w:sz="4" w:space="0" w:color="000000"/>
-          <w:right w:val="single" w:sz="4" w:space="0" w:color="000000"/>
-          <w:insideH w:val="single" w:sz="4" w:space="0" w:color="000000"/>
-          <w:insideV w:val="single" w:sz="4" w:space="0" w:color="000000"/>
-        </w:tblBorders>
       </w:tblPr>
       <w:tblGrid>
         <w:gridCol w:w="4320"/>
@@ -5335,7 +5656,7 @@
       <w:tr>
         <w:tc>
           <w:tcPr>
-            <w:tcW w:type="dxa" w:w="4536"/>
+            <w:tcW w:type="dxa" w:w="4320"/>
             <w:shd w:fill="D9E2F3" w:val="clear"/>
           </w:tcPr>
           <w:p>
@@ -5351,7 +5672,7 @@
         </w:tc>
         <w:tc>
           <w:tcPr>
-            <w:tcW w:type="dxa" w:w="4536"/>
+            <w:tcW w:type="dxa" w:w="4320"/>
             <w:shd w:fill="D9E2F3" w:val="clear"/>
           </w:tcPr>
           <w:p>
@@ -5369,8 +5690,7 @@
       <w:tr>
         <w:tc>
           <w:tcPr>
-            <w:tcW w:type="dxa" w:w="4536"/>
-            <w:shd w:fill="F2F2F2" w:val="clear"/>
+            <w:tcW w:type="dxa" w:w="4320"/>
           </w:tcPr>
           <w:p>
             <w:r/>
@@ -5384,8 +5704,7 @@
         </w:tc>
         <w:tc>
           <w:tcPr>
-            <w:tcW w:type="dxa" w:w="4536"/>
-            <w:shd w:fill="F2F2F2" w:val="clear"/>
+            <w:tcW w:type="dxa" w:w="4320"/>
           </w:tcPr>
           <w:p>
             <w:r/>
@@ -5401,7 +5720,7 @@
       <w:tr>
         <w:tc>
           <w:tcPr>
-            <w:tcW w:type="dxa" w:w="4536"/>
+            <w:tcW w:type="dxa" w:w="4320"/>
           </w:tcPr>
           <w:p>
             <w:r/>
@@ -5415,7 +5734,7 @@
         </w:tc>
         <w:tc>
           <w:tcPr>
-            <w:tcW w:type="dxa" w:w="4536"/>
+            <w:tcW w:type="dxa" w:w="4320"/>
           </w:tcPr>
           <w:p>
             <w:r/>
@@ -5431,8 +5750,7 @@
       <w:tr>
         <w:tc>
           <w:tcPr>
-            <w:tcW w:type="dxa" w:w="4536"/>
-            <w:shd w:fill="F2F2F2" w:val="clear"/>
+            <w:tcW w:type="dxa" w:w="4320"/>
           </w:tcPr>
           <w:p>
             <w:r/>
@@ -5446,8 +5764,7 @@
         </w:tc>
         <w:tc>
           <w:tcPr>
-            <w:tcW w:type="dxa" w:w="4536"/>
-            <w:shd w:fill="F2F2F2" w:val="clear"/>
+            <w:tcW w:type="dxa" w:w="4320"/>
           </w:tcPr>
           <w:p>
             <w:r/>
@@ -5463,7 +5780,7 @@
       <w:tr>
         <w:tc>
           <w:tcPr>
-            <w:tcW w:type="dxa" w:w="4536"/>
+            <w:tcW w:type="dxa" w:w="4320"/>
           </w:tcPr>
           <w:p>
             <w:r/>
@@ -5477,7 +5794,7 @@
         </w:tc>
         <w:tc>
           <w:tcPr>
-            <w:tcW w:type="dxa" w:w="4536"/>
+            <w:tcW w:type="dxa" w:w="4320"/>
           </w:tcPr>
           <w:p>
             <w:r/>
@@ -5493,13 +5810,21 @@
     </w:tbl>
     <w:p/>
     <w:p>
+      <w:pPr>
+        <w:spacing w:before="120" w:after="120"/>
+        <w:pBdr>
+          <w:bottom w:val="single" w:sz="6" w:space="1" w:color="999999"/>
+        </w:pBdr>
+      </w:pPr>
+    </w:p>
+    <w:p>
       <w:r>
         <w:t>*文档版本：v1.0*</w:t>
       </w:r>
     </w:p>
     <w:p>
       <w:r>
-        <w:t>*完成日期：2025 年 6 月*</w:t>
+        <w:t>*完成日期：2026 年 6 月*</w:t>
       </w:r>
     </w:p>
     <w:sectPr>
@@ -5876,7 +6201,7 @@
     <w:qFormat/>
     <w:rsid w:val="00FC693F"/>
     <w:rPr>
-      <w:rFonts w:ascii="Calibri" w:hAnsi="Calibri"/>
+      <w:rFonts w:ascii="Microsoft YaHei" w:hAnsi="Microsoft YaHei"/>
       <w:sz w:val="22"/>
     </w:rPr>
   </w:style>

</xml_diff>